<commit_message>
Week 4: update project plan with Week 4 status and Week 5 additional work
Fills the Week 4 sections: six unplanned work items added to the breakdown,
sixteen completed tasks, the barriers encountered (the big-bang sequencing
risk, the router test that could not pass until the controllers landed, and
the headless Chrome hang), and the verification evidence. Carries CSRF
tokens and the week-5 branch into the Week 5 additional work section.

Co-Authored-By: Claude Opus 5 (1M context) <noreply@anthropic.com>
Claude-Session: https://claude.ai/code/session_01KecNWqjvTDDXrC5mqz631p
</commit_message>
<xml_diff>
--- a/docs/SDC310L Project Plan James Strohm.docx
+++ b/docs/SDC310L Project Plan James Strohm.docx
@@ -7175,6 +7175,492 @@
           </w:p>
         </w:tc>
       </w:tr>
+      <w:tr>
+        <w:trPr/>
+        <w:tc>
+          <w:tcPr>
+            <w:tcW w:w="1998" w:type="dxa"/>
+            <w:tcBorders>
+              <w:top w:val="single" w:sz="4" w:space="0" w:color="000000"/>
+              <w:start w:val="single" w:sz="4" w:space="0" w:color="000000"/>
+              <w:bottom w:val="single" w:sz="4" w:space="0" w:color="000000"/>
+              <w:end w:val="single" w:sz="4" w:space="0" w:color="000000"/>
+            </w:tcBorders>
+          </w:tcPr>
+          <w:p>
+            <w:pPr>
+              <w:pStyle w:val="Normal"/>
+              <w:snapToGrid w:val="false"/>
+              <w:rPr>
+                <w:bCs/>
+              </w:rPr>
+            </w:pPr>
+            <w:r>
+              <w:rPr>
+                <w:bCs/>
+              </w:rPr>
+              <w:t>Design Spec &amp; Plan</w:t>
+            </w:r>
+          </w:p>
+        </w:tc>
+        <w:tc>
+          <w:tcPr>
+            <w:tcW w:w="4230" w:type="dxa"/>
+            <w:tcBorders>
+              <w:top w:val="single" w:sz="4" w:space="0" w:color="000000"/>
+              <w:start w:val="single" w:sz="4" w:space="0" w:color="000000"/>
+              <w:bottom w:val="single" w:sz="4" w:space="0" w:color="000000"/>
+              <w:end w:val="single" w:sz="4" w:space="0" w:color="000000"/>
+            </w:tcBorders>
+          </w:tcPr>
+          <w:p>
+            <w:pPr>
+              <w:pStyle w:val="Normal"/>
+              <w:snapToGrid w:val="false"/>
+              <w:rPr>
+                <w:bCs/>
+              </w:rPr>
+            </w:pPr>
+            <w:r>
+              <w:rPr>
+                <w:bCs/>
+              </w:rPr>
+              <w:t>Wrote a design specification and a ten-task implementation plan before any code moved, covering the layer contract, the route table, the model and controller interfaces, and the verification steps. Reviewing the plan against the spec surfaced four gaps in the spec itself - a missing helpers file, two missing test suites, and the nonexistent-product guard specified for one operation when it belonged on two - all corrected before implementation started. Committed to the repository under docs/.</w:t>
+            </w:r>
+          </w:p>
+        </w:tc>
+        <w:tc>
+          <w:tcPr>
+            <w:tcW w:w="1908" w:type="dxa"/>
+            <w:tcBorders>
+              <w:top w:val="single" w:sz="4" w:space="0" w:color="000000"/>
+              <w:start w:val="single" w:sz="4" w:space="0" w:color="000000"/>
+              <w:bottom w:val="single" w:sz="4" w:space="0" w:color="000000"/>
+              <w:end w:val="single" w:sz="4" w:space="0" w:color="000000"/>
+            </w:tcBorders>
+          </w:tcPr>
+          <w:p>
+            <w:pPr>
+              <w:pStyle w:val="Normal"/>
+              <w:snapToGrid w:val="false"/>
+              <w:rPr>
+                <w:bCs/>
+              </w:rPr>
+            </w:pPr>
+            <w:r>
+              <w:rPr>
+                <w:bCs/>
+              </w:rPr>
+              <w:t>08/22/2026</w:t>
+            </w:r>
+          </w:p>
+        </w:tc>
+      </w:tr>
+      <w:tr>
+        <w:trPr/>
+        <w:tc>
+          <w:tcPr>
+            <w:tcW w:w="1998" w:type="dxa"/>
+            <w:tcBorders>
+              <w:top w:val="single" w:sz="4" w:space="0" w:color="000000"/>
+              <w:start w:val="single" w:sz="4" w:space="0" w:color="000000"/>
+              <w:bottom w:val="single" w:sz="4" w:space="0" w:color="000000"/>
+              <w:end w:val="single" w:sz="4" w:space="0" w:color="000000"/>
+            </w:tcBorders>
+          </w:tcPr>
+          <w:p>
+            <w:pPr>
+              <w:pStyle w:val="Normal"/>
+              <w:snapToGrid w:val="false"/>
+              <w:rPr>
+                <w:bCs/>
+              </w:rPr>
+            </w:pPr>
+            <w:r>
+              <w:rPr>
+                <w:bCs/>
+              </w:rPr>
+              <w:t>Money Model</w:t>
+            </w:r>
+          </w:p>
+        </w:tc>
+        <w:tc>
+          <w:tcPr>
+            <w:tcW w:w="4230" w:type="dxa"/>
+            <w:tcBorders>
+              <w:top w:val="single" w:sz="4" w:space="0" w:color="000000"/>
+              <w:start w:val="single" w:sz="4" w:space="0" w:color="000000"/>
+              <w:bottom w:val="single" w:sz="4" w:space="0" w:color="000000"/>
+              <w:end w:val="single" w:sz="4" w:space="0" w:color="000000"/>
+            </w:tcBorders>
+          </w:tcPr>
+          <w:p>
+            <w:pPr>
+              <w:pStyle w:val="Normal"/>
+              <w:snapToGrid w:val="false"/>
+              <w:rPr>
+                <w:bCs/>
+              </w:rPr>
+            </w:pPr>
+            <w:r>
+              <w:rPr>
+                <w:bCs/>
+              </w:rPr>
+              <w:t>Split currency conversion and display formatting out of the cart into a separate Money model. The plan named only Product and Cart models, but both the Cart and the view templates need to convert and format money, and neither should re-implement the rounding rule.</w:t>
+            </w:r>
+          </w:p>
+        </w:tc>
+        <w:tc>
+          <w:tcPr>
+            <w:tcW w:w="1908" w:type="dxa"/>
+            <w:tcBorders>
+              <w:top w:val="single" w:sz="4" w:space="0" w:color="000000"/>
+              <w:start w:val="single" w:sz="4" w:space="0" w:color="000000"/>
+              <w:bottom w:val="single" w:sz="4" w:space="0" w:color="000000"/>
+              <w:end w:val="single" w:sz="4" w:space="0" w:color="000000"/>
+            </w:tcBorders>
+          </w:tcPr>
+          <w:p>
+            <w:pPr>
+              <w:pStyle w:val="Normal"/>
+              <w:snapToGrid w:val="false"/>
+              <w:rPr>
+                <w:bCs/>
+              </w:rPr>
+            </w:pPr>
+            <w:r>
+              <w:rPr>
+                <w:bCs/>
+              </w:rPr>
+              <w:t>08/22/2026</w:t>
+            </w:r>
+          </w:p>
+        </w:tc>
+      </w:tr>
+      <w:tr>
+        <w:trPr/>
+        <w:tc>
+          <w:tcPr>
+            <w:tcW w:w="1998" w:type="dxa"/>
+            <w:tcBorders>
+              <w:top w:val="single" w:sz="4" w:space="0" w:color="000000"/>
+              <w:start w:val="single" w:sz="4" w:space="0" w:color="000000"/>
+              <w:bottom w:val="single" w:sz="4" w:space="0" w:color="000000"/>
+              <w:end w:val="single" w:sz="4" w:space="0" w:color="000000"/>
+            </w:tcBorders>
+          </w:tcPr>
+          <w:p>
+            <w:pPr>
+              <w:pStyle w:val="Normal"/>
+              <w:snapToGrid w:val="false"/>
+              <w:rPr>
+                <w:bCs/>
+              </w:rPr>
+            </w:pPr>
+            <w:r>
+              <w:rPr>
+                <w:bCs/>
+              </w:rPr>
+              <w:t>Product Guard</w:t>
+            </w:r>
+          </w:p>
+        </w:tc>
+        <w:tc>
+          <w:tcPr>
+            <w:tcW w:w="4230" w:type="dxa"/>
+            <w:tcBorders>
+              <w:top w:val="single" w:sz="4" w:space="0" w:color="000000"/>
+              <w:start w:val="single" w:sz="4" w:space="0" w:color="000000"/>
+              <w:bottom w:val="single" w:sz="4" w:space="0" w:color="000000"/>
+              <w:end w:val="single" w:sz="4" w:space="0" w:color="000000"/>
+            </w:tcBorders>
+          </w:tcPr>
+          <w:p>
+            <w:pPr>
+              <w:pStyle w:val="Normal"/>
+              <w:snapToGrid w:val="false"/>
+              <w:rPr>
+                <w:bCs/>
+              </w:rPr>
+            </w:pPr>
+            <w:r>
+              <w:rPr>
+                <w:bCs/>
+              </w:rPr>
+              <w:t>Fixed a Week 3 defect the restructure exposed: any product_id submitted to the cart was accepted, sat in the session, and was then silently skipped by the cart page, so the visitor's click appeared to do nothing with no explanation. Product-&gt;byId() now guards the two operations that can create a cart line, add and increase; remove and decrease only shrink the cart and need no check.</w:t>
+            </w:r>
+          </w:p>
+        </w:tc>
+        <w:tc>
+          <w:tcPr>
+            <w:tcW w:w="1908" w:type="dxa"/>
+            <w:tcBorders>
+              <w:top w:val="single" w:sz="4" w:space="0" w:color="000000"/>
+              <w:start w:val="single" w:sz="4" w:space="0" w:color="000000"/>
+              <w:bottom w:val="single" w:sz="4" w:space="0" w:color="000000"/>
+              <w:end w:val="single" w:sz="4" w:space="0" w:color="000000"/>
+            </w:tcBorders>
+          </w:tcPr>
+          <w:p>
+            <w:pPr>
+              <w:pStyle w:val="Normal"/>
+              <w:snapToGrid w:val="false"/>
+              <w:rPr>
+                <w:bCs/>
+              </w:rPr>
+            </w:pPr>
+            <w:r>
+              <w:rPr>
+                <w:bCs/>
+              </w:rPr>
+              <w:t>08/22/2026</w:t>
+            </w:r>
+          </w:p>
+        </w:tc>
+      </w:tr>
+      <w:tr>
+        <w:trPr/>
+        <w:tc>
+          <w:tcPr>
+            <w:tcW w:w="1998" w:type="dxa"/>
+            <w:tcBorders>
+              <w:top w:val="single" w:sz="4" w:space="0" w:color="000000"/>
+              <w:start w:val="single" w:sz="4" w:space="0" w:color="000000"/>
+              <w:bottom w:val="single" w:sz="4" w:space="0" w:color="000000"/>
+              <w:end w:val="single" w:sz="4" w:space="0" w:color="000000"/>
+            </w:tcBorders>
+          </w:tcPr>
+          <w:p>
+            <w:pPr>
+              <w:pStyle w:val="Normal"/>
+              <w:snapToGrid w:val="false"/>
+              <w:rPr>
+                <w:bCs/>
+              </w:rPr>
+            </w:pPr>
+            <w:r>
+              <w:rPr>
+                <w:bCs/>
+              </w:rPr>
+              <w:t>Split Qty Forms</w:t>
+            </w:r>
+          </w:p>
+        </w:tc>
+        <w:tc>
+          <w:tcPr>
+            <w:tcW w:w="4230" w:type="dxa"/>
+            <w:tcBorders>
+              <w:top w:val="single" w:sz="4" w:space="0" w:color="000000"/>
+              <w:start w:val="single" w:sz="4" w:space="0" w:color="000000"/>
+              <w:bottom w:val="single" w:sz="4" w:space="0" w:color="000000"/>
+              <w:end w:val="single" w:sz="4" w:space="0" w:color="000000"/>
+            </w:tcBorders>
+          </w:tcPr>
+          <w:p>
+            <w:pPr>
+              <w:pStyle w:val="Normal"/>
+              <w:snapToGrid w:val="false"/>
+              <w:rPr>
+                <w:bCs/>
+              </w:rPr>
+            </w:pPr>
+            <w:r>
+              <w:rPr>
+                <w:bCs/>
+              </w:rPr>
+              <w:t>In Week 3 the minus and plus buttons shared one form and were told apart by their submitted value. Under the front controller the action lives in the URL, so each button needs its own form action, and nested forms are invalid HTML. The control became two sibling forms inside a flex wrapper, with a display:contents rule so the rendered row stays visually identical to Week 3.</w:t>
+            </w:r>
+          </w:p>
+        </w:tc>
+        <w:tc>
+          <w:tcPr>
+            <w:tcW w:w="1908" w:type="dxa"/>
+            <w:tcBorders>
+              <w:top w:val="single" w:sz="4" w:space="0" w:color="000000"/>
+              <w:start w:val="single" w:sz="4" w:space="0" w:color="000000"/>
+              <w:bottom w:val="single" w:sz="4" w:space="0" w:color="000000"/>
+              <w:end w:val="single" w:sz="4" w:space="0" w:color="000000"/>
+            </w:tcBorders>
+          </w:tcPr>
+          <w:p>
+            <w:pPr>
+              <w:pStyle w:val="Normal"/>
+              <w:snapToGrid w:val="false"/>
+              <w:rPr>
+                <w:bCs/>
+              </w:rPr>
+            </w:pPr>
+            <w:r>
+              <w:rPr>
+                <w:bCs/>
+              </w:rPr>
+              <w:t>08/22/2026</w:t>
+            </w:r>
+          </w:p>
+        </w:tc>
+      </w:tr>
+      <w:tr>
+        <w:trPr/>
+        <w:tc>
+          <w:tcPr>
+            <w:tcW w:w="1998" w:type="dxa"/>
+            <w:tcBorders>
+              <w:top w:val="single" w:sz="4" w:space="0" w:color="000000"/>
+              <w:start w:val="single" w:sz="4" w:space="0" w:color="000000"/>
+              <w:bottom w:val="single" w:sz="4" w:space="0" w:color="000000"/>
+              <w:end w:val="single" w:sz="4" w:space="0" w:color="000000"/>
+            </w:tcBorders>
+          </w:tcPr>
+          <w:p>
+            <w:pPr>
+              <w:pStyle w:val="Normal"/>
+              <w:snapToGrid w:val="false"/>
+              <w:rPr>
+                <w:bCs/>
+              </w:rPr>
+            </w:pPr>
+            <w:r>
+              <w:rPr>
+                <w:bCs/>
+              </w:rPr>
+              <w:t>MVC Review Fixes</w:t>
+            </w:r>
+          </w:p>
+        </w:tc>
+        <w:tc>
+          <w:tcPr>
+            <w:tcW w:w="4230" w:type="dxa"/>
+            <w:tcBorders>
+              <w:top w:val="single" w:sz="4" w:space="0" w:color="000000"/>
+              <w:start w:val="single" w:sz="4" w:space="0" w:color="000000"/>
+              <w:bottom w:val="single" w:sz="4" w:space="0" w:color="000000"/>
+              <w:end w:val="single" w:sz="4" w:space="0" w:color="000000"/>
+            </w:tcBorders>
+          </w:tcPr>
+          <w:p>
+            <w:pPr>
+              <w:pStyle w:val="Normal"/>
+              <w:snapToGrid w:val="false"/>
+              <w:rPr>
+                <w:bCs/>
+              </w:rPr>
+            </w:pPr>
+            <w:r>
+              <w:rPr>
+                <w:bCs/>
+              </w:rPr>
+              <w:t>A code review of the Week 4 diff surfaced six findings and five were fixed this week. A HEAD request looped forever, because the router compared the verb exactly against GET so HEAD never resolved and the front controller redirected it back to itself. An array-valued product_id acted on product 1, since (int) on an array is 1 in PHP with no warning. A view template that threw part-way through left its output buffer open, so PHP flushed a half-drawn page at shutdown. A cart entry whose product had left the catalog was counted by the nav badge but skipped by the rendered cart, and nothing cleared it. The restructure had also put views, models, controllers, core, and config under the document root with no deny rule, so config/database.php returned 200 and opened a real MySQL connection for any anonymous request.</w:t>
+            </w:r>
+          </w:p>
+        </w:tc>
+        <w:tc>
+          <w:tcPr>
+            <w:tcW w:w="1908" w:type="dxa"/>
+            <w:tcBorders>
+              <w:top w:val="single" w:sz="4" w:space="0" w:color="000000"/>
+              <w:start w:val="single" w:sz="4" w:space="0" w:color="000000"/>
+              <w:bottom w:val="single" w:sz="4" w:space="0" w:color="000000"/>
+              <w:end w:val="single" w:sz="4" w:space="0" w:color="000000"/>
+            </w:tcBorders>
+          </w:tcPr>
+          <w:p>
+            <w:pPr>
+              <w:pStyle w:val="Normal"/>
+              <w:snapToGrid w:val="false"/>
+              <w:rPr>
+                <w:bCs/>
+              </w:rPr>
+            </w:pPr>
+            <w:r>
+              <w:rPr>
+                <w:bCs/>
+              </w:rPr>
+              <w:t>08/22/2026</w:t>
+            </w:r>
+          </w:p>
+        </w:tc>
+      </w:tr>
+      <w:tr>
+        <w:trPr/>
+        <w:tc>
+          <w:tcPr>
+            <w:tcW w:w="1998" w:type="dxa"/>
+            <w:tcBorders>
+              <w:top w:val="single" w:sz="4" w:space="0" w:color="000000"/>
+              <w:start w:val="single" w:sz="4" w:space="0" w:color="000000"/>
+              <w:bottom w:val="single" w:sz="4" w:space="0" w:color="000000"/>
+              <w:end w:val="single" w:sz="4" w:space="0" w:color="000000"/>
+            </w:tcBorders>
+          </w:tcPr>
+          <w:p>
+            <w:pPr>
+              <w:pStyle w:val="Normal"/>
+              <w:snapToGrid w:val="false"/>
+              <w:rPr>
+                <w:bCs/>
+              </w:rPr>
+            </w:pPr>
+            <w:r>
+              <w:rPr>
+                <w:bCs/>
+              </w:rPr>
+              <w:t>Screenshot Tooling</w:t>
+            </w:r>
+          </w:p>
+        </w:tc>
+        <w:tc>
+          <w:tcPr>
+            <w:tcW w:w="4230" w:type="dxa"/>
+            <w:tcBorders>
+              <w:top w:val="single" w:sz="4" w:space="0" w:color="000000"/>
+              <w:start w:val="single" w:sz="4" w:space="0" w:color="000000"/>
+              <w:bottom w:val="single" w:sz="4" w:space="0" w:color="000000"/>
+              <w:end w:val="single" w:sz="4" w:space="0" w:color="000000"/>
+            </w:tcBorders>
+          </w:tcPr>
+          <w:p>
+            <w:pPr>
+              <w:pStyle w:val="Normal"/>
+              <w:snapToGrid w:val="false"/>
+              <w:rPr>
+                <w:bCs/>
+              </w:rPr>
+            </w:pPr>
+            <w:r>
+              <w:rPr>
+                <w:bCs/>
+              </w:rPr>
+              <w:t>Headless Chrome hung indefinitely when capturing the submission screenshots, the same failure seen in Week 2. Chrome's newer --headless=new mode captured both pages in about ten seconds, so the screenshots are again taken from the live render rather than a mockup.</w:t>
+            </w:r>
+          </w:p>
+        </w:tc>
+        <w:tc>
+          <w:tcPr>
+            <w:tcW w:w="1908" w:type="dxa"/>
+            <w:tcBorders>
+              <w:top w:val="single" w:sz="4" w:space="0" w:color="000000"/>
+              <w:start w:val="single" w:sz="4" w:space="0" w:color="000000"/>
+              <w:bottom w:val="single" w:sz="4" w:space="0" w:color="000000"/>
+              <w:end w:val="single" w:sz="4" w:space="0" w:color="000000"/>
+            </w:tcBorders>
+          </w:tcPr>
+          <w:p>
+            <w:pPr>
+              <w:pStyle w:val="Normal"/>
+              <w:snapToGrid w:val="false"/>
+              <w:rPr>
+                <w:bCs/>
+              </w:rPr>
+            </w:pPr>
+            <w:r>
+              <w:rPr>
+                <w:bCs/>
+              </w:rPr>
+              <w:t>08/22/2026</w:t>
+            </w:r>
+          </w:p>
+        </w:tc>
+      </w:tr>
     </w:tbl>
     <w:p>
       <w:pPr>
@@ -7360,6 +7846,7 @@
                 <w:b/>
                 <w:bCs/>
               </w:rPr>
+              <w:t>MVC Approach</w:t>
             </w:r>
           </w:p>
         </w:tc>
@@ -7385,6 +7872,7 @@
               <w:rPr>
                 <w:bCs/>
               </w:rPr>
+              <w:t>08/22/2026</w:t>
             </w:r>
           </w:p>
         </w:tc>
@@ -7413,6 +7901,7 @@
               <w:rPr>
                 <w:bCs/>
               </w:rPr>
+              <w:t>Product Model</w:t>
             </w:r>
           </w:p>
         </w:tc>
@@ -7438,6 +7927,7 @@
               <w:rPr>
                 <w:bCs/>
               </w:rPr>
+              <w:t>08/22/2026</w:t>
             </w:r>
           </w:p>
         </w:tc>
@@ -7466,6 +7956,7 @@
               <w:rPr>
                 <w:bCs/>
               </w:rPr>
+              <w:t>Cart Model</w:t>
             </w:r>
           </w:p>
         </w:tc>
@@ -7491,6 +7982,748 @@
               <w:rPr>
                 <w:bCs/>
               </w:rPr>
+              <w:t>08/22/2026</w:t>
+            </w:r>
+          </w:p>
+        </w:tc>
+      </w:tr>
+      <w:tr>
+        <w:trPr/>
+        <w:tc>
+          <w:tcPr>
+            <w:tcW w:w="1998" w:type="dxa"/>
+            <w:tcBorders>
+              <w:top w:val="single" w:sz="4" w:space="0" w:color="000000"/>
+              <w:start w:val="single" w:sz="4" w:space="0" w:color="000000"/>
+              <w:bottom w:val="single" w:sz="4" w:space="0" w:color="000000"/>
+              <w:end w:val="single" w:sz="4" w:space="0" w:color="000000"/>
+            </w:tcBorders>
+          </w:tcPr>
+          <w:p>
+            <w:pPr>
+              <w:pStyle w:val="Normal"/>
+              <w:snapToGrid w:val="false"/>
+              <w:rPr>
+                <w:b/>
+                <w:bCs/>
+              </w:rPr>
+            </w:pPr>
+            <w:r>
+              <w:rPr>
+                <w:b/>
+                <w:bCs/>
+              </w:rPr>
+              <w:t>Controllers</w:t>
+            </w:r>
+          </w:p>
+        </w:tc>
+        <w:tc>
+          <w:tcPr>
+            <w:tcW w:w="1908" w:type="dxa"/>
+            <w:tcBorders>
+              <w:top w:val="single" w:sz="4" w:space="0" w:color="000000"/>
+              <w:start w:val="single" w:sz="4" w:space="0" w:color="000000"/>
+              <w:bottom w:val="single" w:sz="4" w:space="0" w:color="000000"/>
+              <w:end w:val="single" w:sz="4" w:space="0" w:color="000000"/>
+            </w:tcBorders>
+          </w:tcPr>
+          <w:p>
+            <w:pPr>
+              <w:pStyle w:val="Normal"/>
+              <w:snapToGrid w:val="false"/>
+              <w:rPr>
+                <w:bCs/>
+              </w:rPr>
+            </w:pPr>
+            <w:r>
+              <w:rPr>
+                <w:bCs/>
+              </w:rPr>
+              <w:t>08/22/2026</w:t>
+            </w:r>
+          </w:p>
+        </w:tc>
+      </w:tr>
+      <w:tr>
+        <w:trPr/>
+        <w:tc>
+          <w:tcPr>
+            <w:tcW w:w="1998" w:type="dxa"/>
+            <w:tcBorders>
+              <w:top w:val="single" w:sz="4" w:space="0" w:color="000000"/>
+              <w:start w:val="single" w:sz="4" w:space="0" w:color="000000"/>
+              <w:bottom w:val="single" w:sz="4" w:space="0" w:color="000000"/>
+              <w:end w:val="single" w:sz="4" w:space="0" w:color="000000"/>
+            </w:tcBorders>
+          </w:tcPr>
+          <w:p>
+            <w:pPr>
+              <w:pStyle w:val="Normal"/>
+              <w:snapToGrid w:val="false"/>
+              <w:rPr>
+                <w:b/>
+                <w:bCs/>
+              </w:rPr>
+            </w:pPr>
+            <w:r>
+              <w:rPr>
+                <w:b/>
+                <w:bCs/>
+              </w:rPr>
+              <w:t>Views</w:t>
+            </w:r>
+          </w:p>
+        </w:tc>
+        <w:tc>
+          <w:tcPr>
+            <w:tcW w:w="1908" w:type="dxa"/>
+            <w:tcBorders>
+              <w:top w:val="single" w:sz="4" w:space="0" w:color="000000"/>
+              <w:start w:val="single" w:sz="4" w:space="0" w:color="000000"/>
+              <w:bottom w:val="single" w:sz="4" w:space="0" w:color="000000"/>
+              <w:end w:val="single" w:sz="4" w:space="0" w:color="000000"/>
+            </w:tcBorders>
+          </w:tcPr>
+          <w:p>
+            <w:pPr>
+              <w:pStyle w:val="Normal"/>
+              <w:snapToGrid w:val="false"/>
+              <w:rPr>
+                <w:bCs/>
+              </w:rPr>
+            </w:pPr>
+            <w:r>
+              <w:rPr>
+                <w:bCs/>
+              </w:rPr>
+              <w:t>08/22/2026</w:t>
+            </w:r>
+          </w:p>
+        </w:tc>
+      </w:tr>
+      <w:tr>
+        <w:trPr/>
+        <w:tc>
+          <w:tcPr>
+            <w:tcW w:w="1998" w:type="dxa"/>
+            <w:tcBorders>
+              <w:top w:val="single" w:sz="4" w:space="0" w:color="000000"/>
+              <w:start w:val="single" w:sz="4" w:space="0" w:color="000000"/>
+              <w:bottom w:val="single" w:sz="4" w:space="0" w:color="000000"/>
+              <w:end w:val="single" w:sz="4" w:space="0" w:color="000000"/>
+            </w:tcBorders>
+          </w:tcPr>
+          <w:p>
+            <w:pPr>
+              <w:pStyle w:val="Normal"/>
+              <w:snapToGrid w:val="false"/>
+              <w:rPr>
+                <w:b/>
+                <w:bCs/>
+              </w:rPr>
+            </w:pPr>
+            <w:r>
+              <w:rPr>
+                <w:b/>
+                <w:bCs/>
+              </w:rPr>
+              <w:t>Front Controller</w:t>
+            </w:r>
+          </w:p>
+        </w:tc>
+        <w:tc>
+          <w:tcPr>
+            <w:tcW w:w="1908" w:type="dxa"/>
+            <w:tcBorders>
+              <w:top w:val="single" w:sz="4" w:space="0" w:color="000000"/>
+              <w:start w:val="single" w:sz="4" w:space="0" w:color="000000"/>
+              <w:bottom w:val="single" w:sz="4" w:space="0" w:color="000000"/>
+              <w:end w:val="single" w:sz="4" w:space="0" w:color="000000"/>
+            </w:tcBorders>
+          </w:tcPr>
+          <w:p>
+            <w:pPr>
+              <w:pStyle w:val="Normal"/>
+              <w:snapToGrid w:val="false"/>
+              <w:rPr>
+                <w:bCs/>
+              </w:rPr>
+            </w:pPr>
+            <w:r>
+              <w:rPr>
+                <w:bCs/>
+              </w:rPr>
+              <w:t>08/22/2026</w:t>
+            </w:r>
+          </w:p>
+        </w:tc>
+      </w:tr>
+      <w:tr>
+        <w:trPr/>
+        <w:tc>
+          <w:tcPr>
+            <w:tcW w:w="1998" w:type="dxa"/>
+            <w:tcBorders>
+              <w:top w:val="single" w:sz="4" w:space="0" w:color="000000"/>
+              <w:start w:val="single" w:sz="4" w:space="0" w:color="000000"/>
+              <w:bottom w:val="single" w:sz="4" w:space="0" w:color="000000"/>
+              <w:end w:val="single" w:sz="4" w:space="0" w:color="000000"/>
+            </w:tcBorders>
+          </w:tcPr>
+          <w:p>
+            <w:pPr>
+              <w:pStyle w:val="Normal"/>
+              <w:snapToGrid w:val="false"/>
+              <w:rPr>
+                <w:b/>
+                <w:bCs/>
+              </w:rPr>
+            </w:pPr>
+            <w:r>
+              <w:rPr>
+                <w:b/>
+                <w:bCs/>
+              </w:rPr>
+              <w:t>Regression Check</w:t>
+            </w:r>
+          </w:p>
+        </w:tc>
+        <w:tc>
+          <w:tcPr>
+            <w:tcW w:w="1908" w:type="dxa"/>
+            <w:tcBorders>
+              <w:top w:val="single" w:sz="4" w:space="0" w:color="000000"/>
+              <w:start w:val="single" w:sz="4" w:space="0" w:color="000000"/>
+              <w:bottom w:val="single" w:sz="4" w:space="0" w:color="000000"/>
+              <w:end w:val="single" w:sz="4" w:space="0" w:color="000000"/>
+            </w:tcBorders>
+          </w:tcPr>
+          <w:p>
+            <w:pPr>
+              <w:pStyle w:val="Normal"/>
+              <w:snapToGrid w:val="false"/>
+              <w:rPr>
+                <w:bCs/>
+              </w:rPr>
+            </w:pPr>
+            <w:r>
+              <w:rPr>
+                <w:bCs/>
+              </w:rPr>
+              <w:t>08/22/2026</w:t>
+            </w:r>
+          </w:p>
+        </w:tc>
+      </w:tr>
+      <w:tr>
+        <w:trPr/>
+        <w:tc>
+          <w:tcPr>
+            <w:tcW w:w="1998" w:type="dxa"/>
+            <w:tcBorders>
+              <w:top w:val="single" w:sz="4" w:space="0" w:color="000000"/>
+              <w:start w:val="single" w:sz="4" w:space="0" w:color="000000"/>
+              <w:bottom w:val="single" w:sz="4" w:space="0" w:color="000000"/>
+              <w:end w:val="single" w:sz="4" w:space="0" w:color="000000"/>
+            </w:tcBorders>
+          </w:tcPr>
+          <w:p>
+            <w:pPr>
+              <w:pStyle w:val="Normal"/>
+              <w:snapToGrid w:val="false"/>
+              <w:rPr>
+                <w:b/>
+                <w:bCs/>
+              </w:rPr>
+            </w:pPr>
+            <w:r>
+              <w:rPr>
+                <w:b/>
+                <w:bCs/>
+              </w:rPr>
+              <w:t>Week 4 Branch</w:t>
+            </w:r>
+          </w:p>
+        </w:tc>
+        <w:tc>
+          <w:tcPr>
+            <w:tcW w:w="1908" w:type="dxa"/>
+            <w:tcBorders>
+              <w:top w:val="single" w:sz="4" w:space="0" w:color="000000"/>
+              <w:start w:val="single" w:sz="4" w:space="0" w:color="000000"/>
+              <w:bottom w:val="single" w:sz="4" w:space="0" w:color="000000"/>
+              <w:end w:val="single" w:sz="4" w:space="0" w:color="000000"/>
+            </w:tcBorders>
+          </w:tcPr>
+          <w:p>
+            <w:pPr>
+              <w:pStyle w:val="Normal"/>
+              <w:snapToGrid w:val="false"/>
+              <w:rPr>
+                <w:bCs/>
+              </w:rPr>
+            </w:pPr>
+            <w:r>
+              <w:rPr>
+                <w:bCs/>
+              </w:rPr>
+              <w:t>08/22/2026</w:t>
+            </w:r>
+          </w:p>
+        </w:tc>
+      </w:tr>
+      <w:tr>
+        <w:trPr/>
+        <w:tc>
+          <w:tcPr>
+            <w:tcW w:w="1998" w:type="dxa"/>
+            <w:tcBorders>
+              <w:top w:val="single" w:sz="4" w:space="0" w:color="000000"/>
+              <w:start w:val="single" w:sz="4" w:space="0" w:color="000000"/>
+              <w:bottom w:val="single" w:sz="4" w:space="0" w:color="000000"/>
+              <w:end w:val="single" w:sz="4" w:space="0" w:color="000000"/>
+            </w:tcBorders>
+          </w:tcPr>
+          <w:p>
+            <w:pPr>
+              <w:pStyle w:val="Normal"/>
+              <w:snapToGrid w:val="false"/>
+              <w:rPr>
+                <w:b/>
+                <w:bCs/>
+              </w:rPr>
+            </w:pPr>
+            <w:r>
+              <w:rPr>
+                <w:b/>
+                <w:bCs/>
+              </w:rPr>
+              <w:t>Port Test Suite</w:t>
+            </w:r>
+          </w:p>
+        </w:tc>
+        <w:tc>
+          <w:tcPr>
+            <w:tcW w:w="1908" w:type="dxa"/>
+            <w:tcBorders>
+              <w:top w:val="single" w:sz="4" w:space="0" w:color="000000"/>
+              <w:start w:val="single" w:sz="4" w:space="0" w:color="000000"/>
+              <w:bottom w:val="single" w:sz="4" w:space="0" w:color="000000"/>
+              <w:end w:val="single" w:sz="4" w:space="0" w:color="000000"/>
+            </w:tcBorders>
+          </w:tcPr>
+          <w:p>
+            <w:pPr>
+              <w:pStyle w:val="Normal"/>
+              <w:snapToGrid w:val="false"/>
+              <w:rPr>
+                <w:bCs/>
+              </w:rPr>
+            </w:pPr>
+            <w:r>
+              <w:rPr>
+                <w:bCs/>
+              </w:rPr>
+              <w:t>08/22/2026</w:t>
+            </w:r>
+          </w:p>
+        </w:tc>
+      </w:tr>
+      <w:tr>
+        <w:trPr/>
+        <w:tc>
+          <w:tcPr>
+            <w:tcW w:w="1998" w:type="dxa"/>
+            <w:tcBorders>
+              <w:top w:val="single" w:sz="4" w:space="0" w:color="000000"/>
+              <w:start w:val="single" w:sz="4" w:space="0" w:color="000000"/>
+              <w:bottom w:val="single" w:sz="4" w:space="0" w:color="000000"/>
+              <w:end w:val="single" w:sz="4" w:space="0" w:color="000000"/>
+            </w:tcBorders>
+          </w:tcPr>
+          <w:p>
+            <w:pPr>
+              <w:pStyle w:val="Normal"/>
+              <w:snapToGrid w:val="false"/>
+              <w:rPr>
+                <w:b/>
+                <w:bCs/>
+              </w:rPr>
+            </w:pPr>
+            <w:r>
+              <w:rPr>
+                <w:b/>
+                <w:bCs/>
+              </w:rPr>
+              <w:t>Front Controller Paths</w:t>
+            </w:r>
+          </w:p>
+        </w:tc>
+        <w:tc>
+          <w:tcPr>
+            <w:tcW w:w="1908" w:type="dxa"/>
+            <w:tcBorders>
+              <w:top w:val="single" w:sz="4" w:space="0" w:color="000000"/>
+              <w:start w:val="single" w:sz="4" w:space="0" w:color="000000"/>
+              <w:bottom w:val="single" w:sz="4" w:space="0" w:color="000000"/>
+              <w:end w:val="single" w:sz="4" w:space="0" w:color="000000"/>
+            </w:tcBorders>
+          </w:tcPr>
+          <w:p>
+            <w:pPr>
+              <w:pStyle w:val="Normal"/>
+              <w:snapToGrid w:val="false"/>
+              <w:rPr>
+                <w:bCs/>
+              </w:rPr>
+            </w:pPr>
+            <w:r>
+              <w:rPr>
+                <w:bCs/>
+              </w:rPr>
+              <w:t>08/22/2026</w:t>
+            </w:r>
+          </w:p>
+        </w:tc>
+      </w:tr>
+      <w:tr>
+        <w:trPr/>
+        <w:tc>
+          <w:tcPr>
+            <w:tcW w:w="1998" w:type="dxa"/>
+            <w:tcBorders>
+              <w:top w:val="single" w:sz="4" w:space="0" w:color="000000"/>
+              <w:start w:val="single" w:sz="4" w:space="0" w:color="000000"/>
+              <w:bottom w:val="single" w:sz="4" w:space="0" w:color="000000"/>
+              <w:end w:val="single" w:sz="4" w:space="0" w:color="000000"/>
+            </w:tcBorders>
+          </w:tcPr>
+          <w:p>
+            <w:pPr>
+              <w:pStyle w:val="Normal"/>
+              <w:snapToGrid w:val="false"/>
+              <w:rPr>
+                <w:b/>
+                <w:bCs/>
+              </w:rPr>
+            </w:pPr>
+            <w:r>
+              <w:rPr>
+                <w:b/>
+                <w:bCs/>
+              </w:rPr>
+              <w:t>Design Spec &amp; Plan</w:t>
+            </w:r>
+          </w:p>
+        </w:tc>
+        <w:tc>
+          <w:tcPr>
+            <w:tcW w:w="1908" w:type="dxa"/>
+            <w:tcBorders>
+              <w:top w:val="single" w:sz="4" w:space="0" w:color="000000"/>
+              <w:start w:val="single" w:sz="4" w:space="0" w:color="000000"/>
+              <w:bottom w:val="single" w:sz="4" w:space="0" w:color="000000"/>
+              <w:end w:val="single" w:sz="4" w:space="0" w:color="000000"/>
+            </w:tcBorders>
+          </w:tcPr>
+          <w:p>
+            <w:pPr>
+              <w:pStyle w:val="Normal"/>
+              <w:snapToGrid w:val="false"/>
+              <w:rPr>
+                <w:bCs/>
+              </w:rPr>
+            </w:pPr>
+            <w:r>
+              <w:rPr>
+                <w:bCs/>
+              </w:rPr>
+              <w:t>08/22/2026</w:t>
+            </w:r>
+          </w:p>
+        </w:tc>
+      </w:tr>
+      <w:tr>
+        <w:trPr/>
+        <w:tc>
+          <w:tcPr>
+            <w:tcW w:w="1998" w:type="dxa"/>
+            <w:tcBorders>
+              <w:top w:val="single" w:sz="4" w:space="0" w:color="000000"/>
+              <w:start w:val="single" w:sz="4" w:space="0" w:color="000000"/>
+              <w:bottom w:val="single" w:sz="4" w:space="0" w:color="000000"/>
+              <w:end w:val="single" w:sz="4" w:space="0" w:color="000000"/>
+            </w:tcBorders>
+          </w:tcPr>
+          <w:p>
+            <w:pPr>
+              <w:pStyle w:val="Normal"/>
+              <w:snapToGrid w:val="false"/>
+              <w:rPr>
+                <w:b/>
+                <w:bCs/>
+              </w:rPr>
+            </w:pPr>
+            <w:r>
+              <w:rPr>
+                <w:b/>
+                <w:bCs/>
+              </w:rPr>
+              <w:t>Money Model</w:t>
+            </w:r>
+          </w:p>
+        </w:tc>
+        <w:tc>
+          <w:tcPr>
+            <w:tcW w:w="1908" w:type="dxa"/>
+            <w:tcBorders>
+              <w:top w:val="single" w:sz="4" w:space="0" w:color="000000"/>
+              <w:start w:val="single" w:sz="4" w:space="0" w:color="000000"/>
+              <w:bottom w:val="single" w:sz="4" w:space="0" w:color="000000"/>
+              <w:end w:val="single" w:sz="4" w:space="0" w:color="000000"/>
+            </w:tcBorders>
+          </w:tcPr>
+          <w:p>
+            <w:pPr>
+              <w:pStyle w:val="Normal"/>
+              <w:snapToGrid w:val="false"/>
+              <w:rPr>
+                <w:bCs/>
+              </w:rPr>
+            </w:pPr>
+            <w:r>
+              <w:rPr>
+                <w:bCs/>
+              </w:rPr>
+              <w:t>08/22/2026</w:t>
+            </w:r>
+          </w:p>
+        </w:tc>
+      </w:tr>
+      <w:tr>
+        <w:trPr/>
+        <w:tc>
+          <w:tcPr>
+            <w:tcW w:w="1998" w:type="dxa"/>
+            <w:tcBorders>
+              <w:top w:val="single" w:sz="4" w:space="0" w:color="000000"/>
+              <w:start w:val="single" w:sz="4" w:space="0" w:color="000000"/>
+              <w:bottom w:val="single" w:sz="4" w:space="0" w:color="000000"/>
+              <w:end w:val="single" w:sz="4" w:space="0" w:color="000000"/>
+            </w:tcBorders>
+          </w:tcPr>
+          <w:p>
+            <w:pPr>
+              <w:pStyle w:val="Normal"/>
+              <w:snapToGrid w:val="false"/>
+              <w:rPr>
+                <w:b/>
+                <w:bCs/>
+              </w:rPr>
+            </w:pPr>
+            <w:r>
+              <w:rPr>
+                <w:b/>
+                <w:bCs/>
+              </w:rPr>
+              <w:t>Product Guard</w:t>
+            </w:r>
+          </w:p>
+        </w:tc>
+        <w:tc>
+          <w:tcPr>
+            <w:tcW w:w="1908" w:type="dxa"/>
+            <w:tcBorders>
+              <w:top w:val="single" w:sz="4" w:space="0" w:color="000000"/>
+              <w:start w:val="single" w:sz="4" w:space="0" w:color="000000"/>
+              <w:bottom w:val="single" w:sz="4" w:space="0" w:color="000000"/>
+              <w:end w:val="single" w:sz="4" w:space="0" w:color="000000"/>
+            </w:tcBorders>
+          </w:tcPr>
+          <w:p>
+            <w:pPr>
+              <w:pStyle w:val="Normal"/>
+              <w:snapToGrid w:val="false"/>
+              <w:rPr>
+                <w:bCs/>
+              </w:rPr>
+            </w:pPr>
+            <w:r>
+              <w:rPr>
+                <w:bCs/>
+              </w:rPr>
+              <w:t>08/22/2026</w:t>
+            </w:r>
+          </w:p>
+        </w:tc>
+      </w:tr>
+      <w:tr>
+        <w:trPr/>
+        <w:tc>
+          <w:tcPr>
+            <w:tcW w:w="1998" w:type="dxa"/>
+            <w:tcBorders>
+              <w:top w:val="single" w:sz="4" w:space="0" w:color="000000"/>
+              <w:start w:val="single" w:sz="4" w:space="0" w:color="000000"/>
+              <w:bottom w:val="single" w:sz="4" w:space="0" w:color="000000"/>
+              <w:end w:val="single" w:sz="4" w:space="0" w:color="000000"/>
+            </w:tcBorders>
+          </w:tcPr>
+          <w:p>
+            <w:pPr>
+              <w:pStyle w:val="Normal"/>
+              <w:snapToGrid w:val="false"/>
+              <w:rPr>
+                <w:b/>
+                <w:bCs/>
+              </w:rPr>
+            </w:pPr>
+            <w:r>
+              <w:rPr>
+                <w:b/>
+                <w:bCs/>
+              </w:rPr>
+              <w:t>Split Qty Forms</w:t>
+            </w:r>
+          </w:p>
+        </w:tc>
+        <w:tc>
+          <w:tcPr>
+            <w:tcW w:w="1908" w:type="dxa"/>
+            <w:tcBorders>
+              <w:top w:val="single" w:sz="4" w:space="0" w:color="000000"/>
+              <w:start w:val="single" w:sz="4" w:space="0" w:color="000000"/>
+              <w:bottom w:val="single" w:sz="4" w:space="0" w:color="000000"/>
+              <w:end w:val="single" w:sz="4" w:space="0" w:color="000000"/>
+            </w:tcBorders>
+          </w:tcPr>
+          <w:p>
+            <w:pPr>
+              <w:pStyle w:val="Normal"/>
+              <w:snapToGrid w:val="false"/>
+              <w:rPr>
+                <w:bCs/>
+              </w:rPr>
+            </w:pPr>
+            <w:r>
+              <w:rPr>
+                <w:bCs/>
+              </w:rPr>
+              <w:t>08/22/2026</w:t>
+            </w:r>
+          </w:p>
+        </w:tc>
+      </w:tr>
+      <w:tr>
+        <w:trPr/>
+        <w:tc>
+          <w:tcPr>
+            <w:tcW w:w="1998" w:type="dxa"/>
+            <w:tcBorders>
+              <w:top w:val="single" w:sz="4" w:space="0" w:color="000000"/>
+              <w:start w:val="single" w:sz="4" w:space="0" w:color="000000"/>
+              <w:bottom w:val="single" w:sz="4" w:space="0" w:color="000000"/>
+              <w:end w:val="single" w:sz="4" w:space="0" w:color="000000"/>
+            </w:tcBorders>
+          </w:tcPr>
+          <w:p>
+            <w:pPr>
+              <w:pStyle w:val="Normal"/>
+              <w:snapToGrid w:val="false"/>
+              <w:rPr>
+                <w:b/>
+                <w:bCs/>
+              </w:rPr>
+            </w:pPr>
+            <w:r>
+              <w:rPr>
+                <w:b/>
+                <w:bCs/>
+              </w:rPr>
+              <w:t>MVC Review Fixes</w:t>
+            </w:r>
+          </w:p>
+        </w:tc>
+        <w:tc>
+          <w:tcPr>
+            <w:tcW w:w="1908" w:type="dxa"/>
+            <w:tcBorders>
+              <w:top w:val="single" w:sz="4" w:space="0" w:color="000000"/>
+              <w:start w:val="single" w:sz="4" w:space="0" w:color="000000"/>
+              <w:bottom w:val="single" w:sz="4" w:space="0" w:color="000000"/>
+              <w:end w:val="single" w:sz="4" w:space="0" w:color="000000"/>
+            </w:tcBorders>
+          </w:tcPr>
+          <w:p>
+            <w:pPr>
+              <w:pStyle w:val="Normal"/>
+              <w:snapToGrid w:val="false"/>
+              <w:rPr>
+                <w:bCs/>
+              </w:rPr>
+            </w:pPr>
+            <w:r>
+              <w:rPr>
+                <w:bCs/>
+              </w:rPr>
+              <w:t>08/22/2026</w:t>
+            </w:r>
+          </w:p>
+        </w:tc>
+      </w:tr>
+      <w:tr>
+        <w:trPr/>
+        <w:tc>
+          <w:tcPr>
+            <w:tcW w:w="1998" w:type="dxa"/>
+            <w:tcBorders>
+              <w:top w:val="single" w:sz="4" w:space="0" w:color="000000"/>
+              <w:start w:val="single" w:sz="4" w:space="0" w:color="000000"/>
+              <w:bottom w:val="single" w:sz="4" w:space="0" w:color="000000"/>
+              <w:end w:val="single" w:sz="4" w:space="0" w:color="000000"/>
+            </w:tcBorders>
+          </w:tcPr>
+          <w:p>
+            <w:pPr>
+              <w:pStyle w:val="Normal"/>
+              <w:snapToGrid w:val="false"/>
+              <w:rPr>
+                <w:b/>
+                <w:bCs/>
+              </w:rPr>
+            </w:pPr>
+            <w:r>
+              <w:rPr>
+                <w:b/>
+                <w:bCs/>
+              </w:rPr>
+              <w:t>Screenshot Tooling</w:t>
+            </w:r>
+          </w:p>
+        </w:tc>
+        <w:tc>
+          <w:tcPr>
+            <w:tcW w:w="1908" w:type="dxa"/>
+            <w:tcBorders>
+              <w:top w:val="single" w:sz="4" w:space="0" w:color="000000"/>
+              <w:start w:val="single" w:sz="4" w:space="0" w:color="000000"/>
+              <w:bottom w:val="single" w:sz="4" w:space="0" w:color="000000"/>
+              <w:end w:val="single" w:sz="4" w:space="0" w:color="000000"/>
+            </w:tcBorders>
+          </w:tcPr>
+          <w:p>
+            <w:pPr>
+              <w:pStyle w:val="Normal"/>
+              <w:snapToGrid w:val="false"/>
+              <w:rPr>
+                <w:bCs/>
+              </w:rPr>
+            </w:pPr>
+            <w:r>
+              <w:rPr>
+                <w:bCs/>
+              </w:rPr>
+              <w:t>08/22/2026</w:t>
             </w:r>
           </w:p>
         </w:tc>
@@ -7652,6 +8885,7 @@
                 <w:b/>
                 <w:bCs/>
               </w:rPr>
+              <w:t>None. All planned Week 4 tasks were completed, plus six unplanned items.</w:t>
             </w:r>
           </w:p>
         </w:tc>
@@ -7797,6 +9031,67 @@
           <w:i/>
           <w:iCs/>
         </w:rPr>
+        <w:t>No planned work was prevented or delayed this week. Three problems came up during development and all three were resolved.</w:t>
+      </w:r>
+    </w:p>
+    <w:p>
+      <w:pPr>
+        <w:pStyle w:val="Normal"/>
+        <w:ind w:start="720" w:end="0"/>
+        <w:rPr>
+          <w:bCs/>
+          <w:i/>
+          <w:i/>
+          <w:iCs/>
+        </w:rPr>
+      </w:pPr>
+      <w:r>
+        <w:rPr>
+          <w:bCs/>
+          <w:i/>
+          <w:iCs/>
+        </w:rPr>
+        <w:t>The first was a sequencing risk rather than a fault. Re-architecting every file at once would have left the application broken and the test suite meaningless for the whole week, with no way to tell a refactoring mistake from a pre-existing bug. I planned the work so that the first eight tasks only add files - the new models, router, view layer, controllers, and templates all sit alongside the working Week 3 code - and the ninth task swaps index.php and deletes the old page scripts in a single commit. The store kept serving and the suite kept passing at every commit up to the swap, so any breakage would have pointed at exactly one change.</w:t>
+      </w:r>
+    </w:p>
+    <w:p>
+      <w:pPr>
+        <w:pStyle w:val="Normal"/>
+        <w:ind w:start="720" w:end="0"/>
+        <w:rPr>
+          <w:bCs/>
+          <w:i/>
+          <w:i/>
+          <w:iCs/>
+        </w:rPr>
+      </w:pPr>
+      <w:r>
+        <w:rPr>
+          <w:bCs/>
+          <w:i/>
+          <w:iCs/>
+        </w:rPr>
+        <w:t>The second was a test that could not pass yet. My router test asserts that every route in the table names a controller method that actually exists, which is the check that stops the route table and the controllers drifting apart. The controllers were two tasks away, so that block would have failed for the wrong reason and masked any real regression in between. I commented it out with a marker naming the task that restores it, and restored it as soon as the controllers landed rather than leaving it disabled.</w:t>
+      </w:r>
+    </w:p>
+    <w:p>
+      <w:pPr>
+        <w:pStyle w:val="Normal"/>
+        <w:ind w:start="720" w:end="0"/>
+        <w:rPr>
+          <w:bCs/>
+          <w:i/>
+          <w:i/>
+          <w:iCs/>
+        </w:rPr>
+      </w:pPr>
+      <w:r>
+        <w:rPr>
+          <w:bCs/>
+          <w:i/>
+          <w:iCs/>
+        </w:rPr>
+        <w:t>The third was tooling. Headless Chrome hung indefinitely when capturing the screenshots, exactly as it did in Week 2, and had to be killed. Chrome's newer --headless=new mode captured both pages in about ten seconds, so the screenshots are taken from the live application rather than a mockup.</w:t>
       </w:r>
     </w:p>
     <w:p>
@@ -7858,6 +9153,99 @@
           <w:iCs/>
           <w:u w:val="single"/>
         </w:rPr>
+        <w:t>No assistance is needed. All planned Week 4 work is complete and verified against actual output rather than inspection: every PHP file passes php -l, the test suite grew from 71 assertions to 234 and exits 0, all seven routes return their expected status codes over Apache (200 for the two pages, 303 for the five cart actions, 404 for an unknown action, and 303 for a cart action reached by GET), the stylesheet still resolves under the front controller, and I walked the full cart flow end to end with a cookie jar and confirmed the printed figures match the Phase3 build exactly - $508.98 in items, $25.45 tax, $50.90 shipping and handling, $585.33 order total. I also checked the layering itself with a grep sweep: $_SESSION appears only in the SessionCart model, no SQL appears outside the models, no markup appears inside a model, and index.php is the only PHP file reachable as a page.</w:t>
+      </w:r>
+    </w:p>
+    <w:p>
+      <w:pPr>
+        <w:pStyle w:val="Normal"/>
+        <w:rPr>
+          <w:b/>
+          <w:bCs/>
+          <w:i/>
+          <w:i/>
+          <w:iCs/>
+          <w:u w:val="single"/>
+        </w:rPr>
+      </w:pPr>
+      <w:r>
+        <w:rPr>
+          <w:b/>
+          <w:bCs/>
+          <w:i/>
+          <w:iCs/>
+          <w:u w:val="single"/>
+        </w:rPr>
+        <w:t>The database schema is unchanged this week - Week 4 was a code re-architecture with no table, column, type, or constraint added, dropped, or altered - so database/onlinestore.sql remains the current export. I compared the live table against the checked-in script rather than assuming, and they match on every column, type, nullability, key, engine, and collation.</w:t>
+      </w:r>
+    </w:p>
+    <w:p>
+      <w:pPr>
+        <w:pStyle w:val="Normal"/>
+        <w:rPr>
+          <w:b/>
+          <w:bCs/>
+          <w:i/>
+          <w:i/>
+          <w:iCs/>
+          <w:u w:val="single"/>
+        </w:rPr>
+      </w:pPr>
+      <w:r>
+        <w:rPr>
+          <w:b/>
+          <w:bCs/>
+          <w:i/>
+          <w:iCs/>
+          <w:u w:val="single"/>
+        </w:rPr>
+        <w:t>I also ran a code review over the full Week 4 diff before calling it done. It raised six findings and I verified each one against the running application rather than taking it at face value - the HEAD loop reproduced as six consecutive 303 redirects, the array-valued product_id really did add product 1, and config/database.php really did answer an anonymous request with 200. Five are fixed and covered by new regression tests; the suite grew from 208 to 234 assertions.</w:t>
+      </w:r>
+    </w:p>
+    <w:p>
+      <w:pPr>
+        <w:pStyle w:val="Normal"/>
+        <w:rPr>
+          <w:b/>
+          <w:bCs/>
+          <w:i/>
+          <w:i/>
+          <w:iCs/>
+          <w:u w:val="single"/>
+        </w:rPr>
+      </w:pPr>
+      <w:r>
+        <w:rPr>
+          <w:b/>
+          <w:bCs/>
+          <w:i/>
+          <w:iCs/>
+          <w:u w:val="single"/>
+        </w:rPr>
+        <w:t>One item carried into Week 5 rather than a blocker: the state-changing POSTs still have no CSRF token. It was the sixth review finding and the only one I chose not to act on this week, because Week 4's scope was the re-architecture itself and the application holds no user accounts or payment data, so the worst a forged request can do is empty a visitor's cart. It is now on the Week 5 breakdown so it does not slip a third time.</w:t>
+      </w:r>
+    </w:p>
+    <w:p>
+      <w:pPr>
+        <w:pStyle w:val="Normal"/>
+        <w:rPr>
+          <w:b/>
+          <w:bCs/>
+          <w:i/>
+          <w:i/>
+          <w:iCs/>
+          <w:u w:val="single"/>
+        </w:rPr>
+      </w:pPr>
+      <w:r>
+        <w:rPr>
+          <w:b/>
+          <w:bCs/>
+          <w:i/>
+          <w:iCs/>
+          <w:u w:val="single"/>
+        </w:rPr>
+        <w:t>One request: please let me know the GitHub username you would like added as a collaborator, and I will add it. The repository is public at https://github.com/jamesstrohm55/SDC310L so it is already visible for grading.</w:t>
       </w:r>
     </w:p>
     <w:p>
@@ -8648,6 +10036,7 @@
               <w:rPr>
                 <w:bCs/>
               </w:rPr>
+              <w:t>CSRF Tokens</w:t>
             </w:r>
           </w:p>
         </w:tc>
@@ -8673,6 +10062,7 @@
               <w:rPr>
                 <w:bCs/>
               </w:rPr>
+              <w:t>Add a CSRF token to every state-changing POST and verify it in the cart controller. Identified in Week 3 as a hardening candidate and deferred twice; Week 5 is the last week to do it.</w:t>
             </w:r>
           </w:p>
         </w:tc>
@@ -8698,6 +10088,7 @@
               <w:rPr>
                 <w:bCs/>
               </w:rPr>
+              <w:t>09/02/2026</w:t>
             </w:r>
           </w:p>
         </w:tc>
@@ -8726,6 +10117,7 @@
               <w:rPr>
                 <w:bCs/>
               </w:rPr>
+              <w:t>Week 5 Branch</w:t>
             </w:r>
           </w:p>
         </w:tc>
@@ -8751,6 +10143,7 @@
               <w:rPr>
                 <w:bCs/>
               </w:rPr>
+              <w:t>Create a week-5 branch off main for the finalization work and merge it back through a GitHub pull request, keeping each week isolated and reviewable.</w:t>
             </w:r>
           </w:p>
         </w:tc>
@@ -8776,6 +10169,7 @@
               <w:rPr>
                 <w:bCs/>
               </w:rPr>
+              <w:t>09/01/2026</w:t>
             </w:r>
           </w:p>
         </w:tc>

</xml_diff>

<commit_message>
Week 5: add the test description and update the project plan
The test description document records the testing for the Week 5
deliverable: the environment, the three-layer approach, fourteen areas
tested with what was tested, how, and what the testing found, the nine
defects found and fixed, a requirements coverage matrix, and an honest
statement of what was not tested.

Every figure in it comes from a run that was read rather than assumed:
266 PHP assertions, 70 end-to-end checks, 9 manual checks, all passing,
both suites exiting 0.

The project plan gains the Week 5 additional work, the completed task
list, the barriers encountered, and the lessons learned section the
template requires for the final week.

Also corrects the end-to-end check count in the README from 68 to 70
after the review fixes added two.

Co-Authored-By: Claude Opus 5 (1M context) <noreply@anthropic.com>
Claude-Session: https://claude.ai/code/session_01H6nsTeiu9gKpXAcxNDLJhA
</commit_message>
<xml_diff>
--- a/docs/SDC310L Project Plan James Strohm.docx
+++ b/docs/SDC310L Project Plan James Strohm.docx
@@ -10198,6 +10198,7 @@
               <w:rPr>
                 <w:bCs/>
               </w:rPr>
+              <w:t>E2E Test Script</w:t>
             </w:r>
           </w:p>
         </w:tc>
@@ -10223,6 +10224,7 @@
               <w:rPr>
                 <w:bCs/>
               </w:rPr>
+              <w:t>Wrote tests/e2e.sh, 70 checks driving the running store over HTTP with a cookie jar so the session cart persists between requests. The PHP suite covers the models in isolation; nothing covered Apache, PHP, and MariaDB working together, which is exactly what this week is supposed to demonstrate. It is also what makes every result in the test document reproducible rather than asserted.</w:t>
             </w:r>
           </w:p>
         </w:tc>
@@ -10248,6 +10250,493 @@
               <w:rPr>
                 <w:bCs/>
               </w:rPr>
+              <w:t>08/27/2026</w:t>
+            </w:r>
+          </w:p>
+        </w:tc>
+      </w:tr>
+      <w:tr>
+        <w:trPr/>
+        <w:tc>
+          <w:tcPr>
+            <w:tcW w:w="1998" w:type="dxa"/>
+            <w:tcBorders>
+              <w:top w:val="single" w:sz="4" w:space="0" w:color="000000"/>
+              <w:start w:val="single" w:sz="4" w:space="0" w:color="000000"/>
+              <w:bottom w:val="single" w:sz="4" w:space="0" w:color="000000"/>
+              <w:end w:val="single" w:sz="4" w:space="0" w:color="000000"/>
+            </w:tcBorders>
+          </w:tcPr>
+          <w:p>
+            <w:pPr>
+              <w:pStyle w:val="Normal"/>
+              <w:snapToGrid w:val="false"/>
+              <w:rPr>
+                <w:bCs/>
+              </w:rPr>
+            </w:pPr>
+            <w:r>
+              <w:rPr>
+                <w:bCs/>
+              </w:rPr>
+              <w:t>Test Exit Code</w:t>
+            </w:r>
+          </w:p>
+        </w:tc>
+        <w:tc>
+          <w:tcPr>
+            <w:tcW w:w="4230" w:type="dxa"/>
+            <w:tcBorders>
+              <w:top w:val="single" w:sz="4" w:space="0" w:color="000000"/>
+              <w:start w:val="single" w:sz="4" w:space="0" w:color="000000"/>
+              <w:bottom w:val="single" w:sz="4" w:space="0" w:color="000000"/>
+              <w:end w:val="single" w:sz="4" w:space="0" w:color="000000"/>
+            </w:tcBorders>
+          </w:tcPr>
+          <w:p>
+            <w:pPr>
+              <w:pStyle w:val="Normal"/>
+              <w:snapToGrid w:val="false"/>
+              <w:rPr>
+                <w:bCs/>
+              </w:rPr>
+            </w:pPr>
+            <w:r>
+              <w:rPr>
+                <w:bCs/>
+              </w:rPr>
+              <w:t>Fixed a defect in the verification harness itself. config/database.php ended with exit() given a string, and exit() with a string exits with status 0, so with MySQL not running the test suite stopped part-way through, never ran three of its six files, and still reported success. The command-line path now exits 1. Reproduced against a dead port before and after the fix rather than reasoned about.</w:t>
+            </w:r>
+          </w:p>
+        </w:tc>
+        <w:tc>
+          <w:tcPr>
+            <w:tcW w:w="1908" w:type="dxa"/>
+            <w:tcBorders>
+              <w:top w:val="single" w:sz="4" w:space="0" w:color="000000"/>
+              <w:start w:val="single" w:sz="4" w:space="0" w:color="000000"/>
+              <w:bottom w:val="single" w:sz="4" w:space="0" w:color="000000"/>
+              <w:end w:val="single" w:sz="4" w:space="0" w:color="000000"/>
+            </w:tcBorders>
+          </w:tcPr>
+          <w:p>
+            <w:pPr>
+              <w:pStyle w:val="Normal"/>
+              <w:snapToGrid w:val="false"/>
+              <w:rPr>
+                <w:bCs/>
+              </w:rPr>
+            </w:pPr>
+            <w:r>
+              <w:rPr>
+                <w:bCs/>
+              </w:rPr>
+              <w:t>08/27/2026</w:t>
+            </w:r>
+          </w:p>
+        </w:tc>
+      </w:tr>
+      <w:tr>
+        <w:trPr/>
+        <w:tc>
+          <w:tcPr>
+            <w:tcW w:w="1998" w:type="dxa"/>
+            <w:tcBorders>
+              <w:top w:val="single" w:sz="4" w:space="0" w:color="000000"/>
+              <w:start w:val="single" w:sz="4" w:space="0" w:color="000000"/>
+              <w:bottom w:val="single" w:sz="4" w:space="0" w:color="000000"/>
+              <w:end w:val="single" w:sz="4" w:space="0" w:color="000000"/>
+            </w:tcBorders>
+          </w:tcPr>
+          <w:p>
+            <w:pPr>
+              <w:pStyle w:val="Normal"/>
+              <w:snapToGrid w:val="false"/>
+              <w:rPr>
+                <w:bCs/>
+              </w:rPr>
+            </w:pPr>
+            <w:r>
+              <w:rPr>
+                <w:bCs/>
+              </w:rPr>
+              <w:t>Typed Flash Messages</w:t>
+            </w:r>
+          </w:p>
+        </w:tc>
+        <w:tc>
+          <w:tcPr>
+            <w:tcW w:w="4230" w:type="dxa"/>
+            <w:tcBorders>
+              <w:top w:val="single" w:sz="4" w:space="0" w:color="000000"/>
+              <w:start w:val="single" w:sz="4" w:space="0" w:color="000000"/>
+              <w:bottom w:val="single" w:sz="4" w:space="0" w:color="000000"/>
+              <w:end w:val="single" w:sz="4" w:space="0" w:color="000000"/>
+            </w:tcBorders>
+          </w:tcPr>
+          <w:p>
+            <w:pPr>
+              <w:pStyle w:val="Normal"/>
+              <w:snapToGrid w:val="false"/>
+              <w:rPr>
+                <w:bCs/>
+              </w:rPr>
+            </w:pPr>
+            <w:r>
+              <w:rPr>
+                <w:bCs/>
+              </w:rPr>
+              <w:t>The one-time message stored in the session carried no type, so the new CSRF rejection would have rendered in the green success styling and told the visitor their action had worked when nothing happened. Messages now carry a type and the layout renders success and warning differently. Flash rendering also moved from the two page templates into the shared layout, so the 404 page can show one too.</w:t>
+            </w:r>
+          </w:p>
+        </w:tc>
+        <w:tc>
+          <w:tcPr>
+            <w:tcW w:w="1908" w:type="dxa"/>
+            <w:tcBorders>
+              <w:top w:val="single" w:sz="4" w:space="0" w:color="000000"/>
+              <w:start w:val="single" w:sz="4" w:space="0" w:color="000000"/>
+              <w:bottom w:val="single" w:sz="4" w:space="0" w:color="000000"/>
+              <w:end w:val="single" w:sz="4" w:space="0" w:color="000000"/>
+            </w:tcBorders>
+          </w:tcPr>
+          <w:p>
+            <w:pPr>
+              <w:pStyle w:val="Normal"/>
+              <w:snapToGrid w:val="false"/>
+              <w:rPr>
+                <w:bCs/>
+              </w:rPr>
+            </w:pPr>
+            <w:r>
+              <w:rPr>
+                <w:bCs/>
+              </w:rPr>
+              <w:t>08/27/2026</w:t>
+            </w:r>
+          </w:p>
+        </w:tc>
+      </w:tr>
+      <w:tr>
+        <w:trPr/>
+        <w:tc>
+          <w:tcPr>
+            <w:tcW w:w="1998" w:type="dxa"/>
+            <w:tcBorders>
+              <w:top w:val="single" w:sz="4" w:space="0" w:color="000000"/>
+              <w:start w:val="single" w:sz="4" w:space="0" w:color="000000"/>
+              <w:bottom w:val="single" w:sz="4" w:space="0" w:color="000000"/>
+              <w:end w:val="single" w:sz="4" w:space="0" w:color="000000"/>
+            </w:tcBorders>
+          </w:tcPr>
+          <w:p>
+            <w:pPr>
+              <w:pStyle w:val="Normal"/>
+              <w:snapToGrid w:val="false"/>
+              <w:rPr>
+                <w:bCs/>
+              </w:rPr>
+            </w:pPr>
+            <w:r>
+              <w:rPr>
+                <w:bCs/>
+              </w:rPr>
+              <w:t>Cart Column Widths</w:t>
+            </w:r>
+          </w:p>
+        </w:tc>
+        <w:tc>
+          <w:tcPr>
+            <w:tcW w:w="4230" w:type="dxa"/>
+            <w:tcBorders>
+              <w:top w:val="single" w:sz="4" w:space="0" w:color="000000"/>
+              <w:start w:val="single" w:sz="4" w:space="0" w:color="000000"/>
+              <w:bottom w:val="single" w:sz="4" w:space="0" w:color="000000"/>
+              <w:end w:val="single" w:sz="4" w:space="0" w:color="000000"/>
+            </w:tcBorders>
+          </w:tcPr>
+          <w:p>
+            <w:pPr>
+              <w:pStyle w:val="Normal"/>
+              <w:snapToGrid w:val="false"/>
+              <w:rPr>
+                <w:bCs/>
+              </w:rPr>
+            </w:pPr>
+            <w:r>
+              <w:rPr>
+                <w:bCs/>
+              </w:rPr>
+              <w:t>The new two-column cart layout narrowed the table but kept the column widths tuned for the full page width, so the Remove buttons were clipped off the right edge of the scroll container. Found by looking at the rendered screenshot — the markup and the HTTP response were both correct, so no automated check would have caught it.</w:t>
+            </w:r>
+          </w:p>
+        </w:tc>
+        <w:tc>
+          <w:tcPr>
+            <w:tcW w:w="1908" w:type="dxa"/>
+            <w:tcBorders>
+              <w:top w:val="single" w:sz="4" w:space="0" w:color="000000"/>
+              <w:start w:val="single" w:sz="4" w:space="0" w:color="000000"/>
+              <w:bottom w:val="single" w:sz="4" w:space="0" w:color="000000"/>
+              <w:end w:val="single" w:sz="4" w:space="0" w:color="000000"/>
+            </w:tcBorders>
+          </w:tcPr>
+          <w:p>
+            <w:pPr>
+              <w:pStyle w:val="Normal"/>
+              <w:snapToGrid w:val="false"/>
+              <w:rPr>
+                <w:bCs/>
+              </w:rPr>
+            </w:pPr>
+            <w:r>
+              <w:rPr>
+                <w:bCs/>
+              </w:rPr>
+              <w:t>08/27/2026</w:t>
+            </w:r>
+          </w:p>
+        </w:tc>
+      </w:tr>
+      <w:tr>
+        <w:trPr/>
+        <w:tc>
+          <w:tcPr>
+            <w:tcW w:w="1998" w:type="dxa"/>
+            <w:tcBorders>
+              <w:top w:val="single" w:sz="4" w:space="0" w:color="000000"/>
+              <w:start w:val="single" w:sz="4" w:space="0" w:color="000000"/>
+              <w:bottom w:val="single" w:sz="4" w:space="0" w:color="000000"/>
+              <w:end w:val="single" w:sz="4" w:space="0" w:color="000000"/>
+            </w:tcBorders>
+          </w:tcPr>
+          <w:p>
+            <w:pPr>
+              <w:pStyle w:val="Normal"/>
+              <w:snapToGrid w:val="false"/>
+              <w:rPr>
+                <w:bCs/>
+              </w:rPr>
+            </w:pPr>
+            <w:r>
+              <w:rPr>
+                <w:bCs/>
+              </w:rPr>
+              <w:t>Schema Verification</w:t>
+            </w:r>
+          </w:p>
+        </w:tc>
+        <w:tc>
+          <w:tcPr>
+            <w:tcW w:w="4230" w:type="dxa"/>
+            <w:tcBorders>
+              <w:top w:val="single" w:sz="4" w:space="0" w:color="000000"/>
+              <w:start w:val="single" w:sz="4" w:space="0" w:color="000000"/>
+              <w:bottom w:val="single" w:sz="4" w:space="0" w:color="000000"/>
+              <w:end w:val="single" w:sz="4" w:space="0" w:color="000000"/>
+            </w:tcBorders>
+          </w:tcPr>
+          <w:p>
+            <w:pPr>
+              <w:pStyle w:val="Normal"/>
+              <w:snapToGrid w:val="false"/>
+              <w:rPr>
+                <w:bCs/>
+              </w:rPr>
+            </w:pPr>
+            <w:r>
+              <w:rPr>
+                <w:bCs/>
+              </w:rPr>
+              <w:t>Rather than assert the database was unchanged, imported the checked-in SQL script into a scratch database and diffed both the CREATE TABLE statement and the full row set against the live database. Both are identical, so no re-export was required for the submission.</w:t>
+            </w:r>
+          </w:p>
+        </w:tc>
+        <w:tc>
+          <w:tcPr>
+            <w:tcW w:w="1908" w:type="dxa"/>
+            <w:tcBorders>
+              <w:top w:val="single" w:sz="4" w:space="0" w:color="000000"/>
+              <w:start w:val="single" w:sz="4" w:space="0" w:color="000000"/>
+              <w:bottom w:val="single" w:sz="4" w:space="0" w:color="000000"/>
+              <w:end w:val="single" w:sz="4" w:space="0" w:color="000000"/>
+            </w:tcBorders>
+          </w:tcPr>
+          <w:p>
+            <w:pPr>
+              <w:pStyle w:val="Normal"/>
+              <w:snapToGrid w:val="false"/>
+              <w:rPr>
+                <w:bCs/>
+              </w:rPr>
+            </w:pPr>
+            <w:r>
+              <w:rPr>
+                <w:bCs/>
+              </w:rPr>
+              <w:t>08/27/2026</w:t>
+            </w:r>
+          </w:p>
+        </w:tc>
+      </w:tr>
+      <w:tr>
+        <w:trPr/>
+        <w:tc>
+          <w:tcPr>
+            <w:tcW w:w="1998" w:type="dxa"/>
+            <w:tcBorders>
+              <w:top w:val="single" w:sz="4" w:space="0" w:color="000000"/>
+              <w:start w:val="single" w:sz="4" w:space="0" w:color="000000"/>
+              <w:bottom w:val="single" w:sz="4" w:space="0" w:color="000000"/>
+              <w:end w:val="single" w:sz="4" w:space="0" w:color="000000"/>
+            </w:tcBorders>
+          </w:tcPr>
+          <w:p>
+            <w:pPr>
+              <w:pStyle w:val="Normal"/>
+              <w:snapToGrid w:val="false"/>
+              <w:rPr>
+                <w:bCs/>
+              </w:rPr>
+            </w:pPr>
+            <w:r>
+              <w:rPr>
+                <w:bCs/>
+              </w:rPr>
+              <w:t>Week 5 Review Fixes</w:t>
+            </w:r>
+          </w:p>
+        </w:tc>
+        <w:tc>
+          <w:tcPr>
+            <w:tcW w:w="4230" w:type="dxa"/>
+            <w:tcBorders>
+              <w:top w:val="single" w:sz="4" w:space="0" w:color="000000"/>
+              <w:start w:val="single" w:sz="4" w:space="0" w:color="000000"/>
+              <w:bottom w:val="single" w:sz="4" w:space="0" w:color="000000"/>
+              <w:end w:val="single" w:sz="4" w:space="0" w:color="000000"/>
+            </w:tcBorders>
+          </w:tcPr>
+          <w:p>
+            <w:pPr>
+              <w:pStyle w:val="Normal"/>
+              <w:snapToGrid w:val="false"/>
+              <w:rPr>
+                <w:bCs/>
+              </w:rPr>
+            </w:pPr>
+            <w:r>
+              <w:rPr>
+                <w:bCs/>
+              </w:rPr>
+              <w:t>A code review of the Week 5 diff surfaced seven findings and all seven were fixed. It found no correctness bug in the application code; four of the seven were defects in the new test script, which is its own lesson. Two checks could not have failed whatever the application did: a two-line grep needle that matched if either half was present, and an "adds up" assertion that compared hardcoded literals to each other. A third reported a pass when the database was unreachable, because both sides of its comparison were the empty string — and my first attempt at that guard had the same bug it was fixing, calling exit inside a command substitution where it only leaves the subshell. In the application, a forged POST could overwrite a pending flash and replace a visitor's order confirmation with a failure notice, and an aria-labelledby on a roleless span was announcing nothing. Every repaired check now has a negative control proving it can fail.</w:t>
+            </w:r>
+          </w:p>
+        </w:tc>
+        <w:tc>
+          <w:tcPr>
+            <w:tcW w:w="1908" w:type="dxa"/>
+            <w:tcBorders>
+              <w:top w:val="single" w:sz="4" w:space="0" w:color="000000"/>
+              <w:start w:val="single" w:sz="4" w:space="0" w:color="000000"/>
+              <w:bottom w:val="single" w:sz="4" w:space="0" w:color="000000"/>
+              <w:end w:val="single" w:sz="4" w:space="0" w:color="000000"/>
+            </w:tcBorders>
+          </w:tcPr>
+          <w:p>
+            <w:pPr>
+              <w:pStyle w:val="Normal"/>
+              <w:snapToGrid w:val="false"/>
+              <w:rPr>
+                <w:bCs/>
+              </w:rPr>
+            </w:pPr>
+            <w:r>
+              <w:rPr>
+                <w:bCs/>
+              </w:rPr>
+              <w:t>08/27/2026</w:t>
+            </w:r>
+          </w:p>
+        </w:tc>
+      </w:tr>
+      <w:tr>
+        <w:trPr/>
+        <w:tc>
+          <w:tcPr>
+            <w:tcW w:w="1998" w:type="dxa"/>
+            <w:tcBorders>
+              <w:top w:val="single" w:sz="4" w:space="0" w:color="000000"/>
+              <w:start w:val="single" w:sz="4" w:space="0" w:color="000000"/>
+              <w:bottom w:val="single" w:sz="4" w:space="0" w:color="000000"/>
+              <w:end w:val="single" w:sz="4" w:space="0" w:color="000000"/>
+            </w:tcBorders>
+          </w:tcPr>
+          <w:p>
+            <w:pPr>
+              <w:pStyle w:val="Normal"/>
+              <w:snapToGrid w:val="false"/>
+              <w:rPr>
+                <w:bCs/>
+              </w:rPr>
+            </w:pPr>
+            <w:r>
+              <w:rPr>
+                <w:bCs/>
+              </w:rPr>
+              <w:t>Screenshot Tooling</w:t>
+            </w:r>
+          </w:p>
+        </w:tc>
+        <w:tc>
+          <w:tcPr>
+            <w:tcW w:w="4230" w:type="dxa"/>
+            <w:tcBorders>
+              <w:top w:val="single" w:sz="4" w:space="0" w:color="000000"/>
+              <w:start w:val="single" w:sz="4" w:space="0" w:color="000000"/>
+              <w:bottom w:val="single" w:sz="4" w:space="0" w:color="000000"/>
+              <w:end w:val="single" w:sz="4" w:space="0" w:color="000000"/>
+            </w:tcBorders>
+          </w:tcPr>
+          <w:p>
+            <w:pPr>
+              <w:pStyle w:val="Normal"/>
+              <w:snapToGrid w:val="false"/>
+              <w:rPr>
+                <w:bCs/>
+              </w:rPr>
+            </w:pPr>
+            <w:r>
+              <w:rPr>
+                <w:bCs/>
+              </w:rPr>
+              <w:t>Headless Chrome hung again when capturing the submission screenshots, as in Weeks 2 and 4, and this time --headless=new did not resolve it on its own. Chrome writes the PNG and then hangs on exit, so the capture is now wrapped in a wait-and-kill loop with the background services disabled. Screenshots are again taken from the live render, not a mockup.</w:t>
+            </w:r>
+          </w:p>
+        </w:tc>
+        <w:tc>
+          <w:tcPr>
+            <w:tcW w:w="1908" w:type="dxa"/>
+            <w:tcBorders>
+              <w:top w:val="single" w:sz="4" w:space="0" w:color="000000"/>
+              <w:start w:val="single" w:sz="4" w:space="0" w:color="000000"/>
+              <w:bottom w:val="single" w:sz="4" w:space="0" w:color="000000"/>
+              <w:end w:val="single" w:sz="4" w:space="0" w:color="000000"/>
+            </w:tcBorders>
+          </w:tcPr>
+          <w:p>
+            <w:pPr>
+              <w:pStyle w:val="Normal"/>
+              <w:snapToGrid w:val="false"/>
+              <w:rPr>
+                <w:bCs/>
+              </w:rPr>
+            </w:pPr>
+            <w:r>
+              <w:rPr>
+                <w:bCs/>
+              </w:rPr>
+              <w:t>08/27/2026</w:t>
             </w:r>
           </w:p>
         </w:tc>
@@ -10437,6 +10926,7 @@
                 <w:b/>
                 <w:bCs/>
               </w:rPr>
+              <w:t>UI Polish</w:t>
             </w:r>
           </w:p>
         </w:tc>
@@ -10462,6 +10952,7 @@
               <w:rPr>
                 <w:bCs/>
               </w:rPr>
+              <w:t>08/27/2026</w:t>
             </w:r>
           </w:p>
         </w:tc>
@@ -10490,6 +10981,7 @@
               <w:rPr>
                 <w:bCs/>
               </w:rPr>
+              <w:t>Test Descriptions</w:t>
             </w:r>
           </w:p>
         </w:tc>
@@ -10515,6 +11007,7 @@
               <w:rPr>
                 <w:bCs/>
               </w:rPr>
+              <w:t>08/27/2026</w:t>
             </w:r>
           </w:p>
         </w:tc>
@@ -10543,6 +11036,7 @@
               <w:rPr>
                 <w:bCs/>
               </w:rPr>
+              <w:t>Execute Tests</w:t>
             </w:r>
           </w:p>
         </w:tc>
@@ -10568,6 +11062,667 @@
               <w:rPr>
                 <w:bCs/>
               </w:rPr>
+              <w:t>08/27/2026</w:t>
+            </w:r>
+          </w:p>
+        </w:tc>
+      </w:tr>
+      <w:tr>
+        <w:trPr/>
+        <w:tc>
+          <w:tcPr>
+            <w:tcW w:w="1998" w:type="dxa"/>
+            <w:tcBorders>
+              <w:top w:val="single" w:sz="4" w:space="0" w:color="000000"/>
+              <w:start w:val="single" w:sz="4" w:space="0" w:color="000000"/>
+              <w:bottom w:val="single" w:sz="4" w:space="0" w:color="000000"/>
+              <w:end w:val="single" w:sz="4" w:space="0" w:color="000000"/>
+            </w:tcBorders>
+          </w:tcPr>
+          <w:p>
+            <w:pPr>
+              <w:pStyle w:val="Normal"/>
+              <w:snapToGrid w:val="false"/>
+              <w:rPr>
+                <w:bCs/>
+              </w:rPr>
+            </w:pPr>
+            <w:r>
+              <w:rPr>
+                <w:bCs/>
+              </w:rPr>
+              <w:t>Fix Defects</w:t>
+            </w:r>
+          </w:p>
+        </w:tc>
+        <w:tc>
+          <w:tcPr>
+            <w:tcW w:w="1908" w:type="dxa"/>
+            <w:tcBorders>
+              <w:top w:val="single" w:sz="4" w:space="0" w:color="000000"/>
+              <w:start w:val="single" w:sz="4" w:space="0" w:color="000000"/>
+              <w:bottom w:val="single" w:sz="4" w:space="0" w:color="000000"/>
+              <w:end w:val="single" w:sz="4" w:space="0" w:color="000000"/>
+            </w:tcBorders>
+          </w:tcPr>
+          <w:p>
+            <w:pPr>
+              <w:pStyle w:val="Normal"/>
+              <w:snapToGrid w:val="false"/>
+              <w:rPr>
+                <w:bCs/>
+              </w:rPr>
+            </w:pPr>
+            <w:r>
+              <w:rPr>
+                <w:bCs/>
+              </w:rPr>
+              <w:t>08/27/2026</w:t>
+            </w:r>
+          </w:p>
+        </w:tc>
+      </w:tr>
+      <w:tr>
+        <w:trPr/>
+        <w:tc>
+          <w:tcPr>
+            <w:tcW w:w="1998" w:type="dxa"/>
+            <w:tcBorders>
+              <w:top w:val="single" w:sz="4" w:space="0" w:color="000000"/>
+              <w:start w:val="single" w:sz="4" w:space="0" w:color="000000"/>
+              <w:bottom w:val="single" w:sz="4" w:space="0" w:color="000000"/>
+              <w:end w:val="single" w:sz="4" w:space="0" w:color="000000"/>
+            </w:tcBorders>
+          </w:tcPr>
+          <w:p>
+            <w:pPr>
+              <w:pStyle w:val="Normal"/>
+              <w:snapToGrid w:val="false"/>
+              <w:rPr>
+                <w:bCs/>
+              </w:rPr>
+            </w:pPr>
+            <w:r>
+              <w:rPr>
+                <w:bCs/>
+              </w:rPr>
+              <w:t>Retrospective</w:t>
+            </w:r>
+          </w:p>
+        </w:tc>
+        <w:tc>
+          <w:tcPr>
+            <w:tcW w:w="1908" w:type="dxa"/>
+            <w:tcBorders>
+              <w:top w:val="single" w:sz="4" w:space="0" w:color="000000"/>
+              <w:start w:val="single" w:sz="4" w:space="0" w:color="000000"/>
+              <w:bottom w:val="single" w:sz="4" w:space="0" w:color="000000"/>
+              <w:end w:val="single" w:sz="4" w:space="0" w:color="000000"/>
+            </w:tcBorders>
+          </w:tcPr>
+          <w:p>
+            <w:pPr>
+              <w:pStyle w:val="Normal"/>
+              <w:snapToGrid w:val="false"/>
+              <w:rPr>
+                <w:bCs/>
+              </w:rPr>
+            </w:pPr>
+            <w:r>
+              <w:rPr>
+                <w:bCs/>
+              </w:rPr>
+              <w:t>08/27/2026</w:t>
+            </w:r>
+          </w:p>
+        </w:tc>
+      </w:tr>
+      <w:tr>
+        <w:trPr/>
+        <w:tc>
+          <w:tcPr>
+            <w:tcW w:w="1998" w:type="dxa"/>
+            <w:tcBorders>
+              <w:top w:val="single" w:sz="4" w:space="0" w:color="000000"/>
+              <w:start w:val="single" w:sz="4" w:space="0" w:color="000000"/>
+              <w:bottom w:val="single" w:sz="4" w:space="0" w:color="000000"/>
+              <w:end w:val="single" w:sz="4" w:space="0" w:color="000000"/>
+            </w:tcBorders>
+          </w:tcPr>
+          <w:p>
+            <w:pPr>
+              <w:pStyle w:val="Normal"/>
+              <w:snapToGrid w:val="false"/>
+              <w:rPr>
+                <w:bCs/>
+              </w:rPr>
+            </w:pPr>
+            <w:r>
+              <w:rPr>
+                <w:bCs/>
+              </w:rPr>
+              <w:t>Final Submission</w:t>
+            </w:r>
+          </w:p>
+        </w:tc>
+        <w:tc>
+          <w:tcPr>
+            <w:tcW w:w="1908" w:type="dxa"/>
+            <w:tcBorders>
+              <w:top w:val="single" w:sz="4" w:space="0" w:color="000000"/>
+              <w:start w:val="single" w:sz="4" w:space="0" w:color="000000"/>
+              <w:bottom w:val="single" w:sz="4" w:space="0" w:color="000000"/>
+              <w:end w:val="single" w:sz="4" w:space="0" w:color="000000"/>
+            </w:tcBorders>
+          </w:tcPr>
+          <w:p>
+            <w:pPr>
+              <w:pStyle w:val="Normal"/>
+              <w:snapToGrid w:val="false"/>
+              <w:rPr>
+                <w:bCs/>
+              </w:rPr>
+            </w:pPr>
+            <w:r>
+              <w:rPr>
+                <w:bCs/>
+              </w:rPr>
+              <w:t>08/27/2026</w:t>
+            </w:r>
+          </w:p>
+        </w:tc>
+      </w:tr>
+      <w:tr>
+        <w:trPr/>
+        <w:tc>
+          <w:tcPr>
+            <w:tcW w:w="1998" w:type="dxa"/>
+            <w:tcBorders>
+              <w:top w:val="single" w:sz="4" w:space="0" w:color="000000"/>
+              <w:start w:val="single" w:sz="4" w:space="0" w:color="000000"/>
+              <w:bottom w:val="single" w:sz="4" w:space="0" w:color="000000"/>
+              <w:end w:val="single" w:sz="4" w:space="0" w:color="000000"/>
+            </w:tcBorders>
+          </w:tcPr>
+          <w:p>
+            <w:pPr>
+              <w:pStyle w:val="Normal"/>
+              <w:snapToGrid w:val="false"/>
+              <w:rPr>
+                <w:bCs/>
+              </w:rPr>
+            </w:pPr>
+            <w:r>
+              <w:rPr>
+                <w:bCs/>
+              </w:rPr>
+              <w:t>CSRF Tokens</w:t>
+            </w:r>
+          </w:p>
+        </w:tc>
+        <w:tc>
+          <w:tcPr>
+            <w:tcW w:w="1908" w:type="dxa"/>
+            <w:tcBorders>
+              <w:top w:val="single" w:sz="4" w:space="0" w:color="000000"/>
+              <w:start w:val="single" w:sz="4" w:space="0" w:color="000000"/>
+              <w:bottom w:val="single" w:sz="4" w:space="0" w:color="000000"/>
+              <w:end w:val="single" w:sz="4" w:space="0" w:color="000000"/>
+            </w:tcBorders>
+          </w:tcPr>
+          <w:p>
+            <w:pPr>
+              <w:pStyle w:val="Normal"/>
+              <w:snapToGrid w:val="false"/>
+              <w:rPr>
+                <w:bCs/>
+              </w:rPr>
+            </w:pPr>
+            <w:r>
+              <w:rPr>
+                <w:bCs/>
+              </w:rPr>
+              <w:t>08/27/2026</w:t>
+            </w:r>
+          </w:p>
+        </w:tc>
+      </w:tr>
+      <w:tr>
+        <w:trPr/>
+        <w:tc>
+          <w:tcPr>
+            <w:tcW w:w="1998" w:type="dxa"/>
+            <w:tcBorders>
+              <w:top w:val="single" w:sz="4" w:space="0" w:color="000000"/>
+              <w:start w:val="single" w:sz="4" w:space="0" w:color="000000"/>
+              <w:bottom w:val="single" w:sz="4" w:space="0" w:color="000000"/>
+              <w:end w:val="single" w:sz="4" w:space="0" w:color="000000"/>
+            </w:tcBorders>
+          </w:tcPr>
+          <w:p>
+            <w:pPr>
+              <w:pStyle w:val="Normal"/>
+              <w:snapToGrid w:val="false"/>
+              <w:rPr>
+                <w:bCs/>
+              </w:rPr>
+            </w:pPr>
+            <w:r>
+              <w:rPr>
+                <w:bCs/>
+              </w:rPr>
+              <w:t>Week 5 Branch</w:t>
+            </w:r>
+          </w:p>
+        </w:tc>
+        <w:tc>
+          <w:tcPr>
+            <w:tcW w:w="1908" w:type="dxa"/>
+            <w:tcBorders>
+              <w:top w:val="single" w:sz="4" w:space="0" w:color="000000"/>
+              <w:start w:val="single" w:sz="4" w:space="0" w:color="000000"/>
+              <w:bottom w:val="single" w:sz="4" w:space="0" w:color="000000"/>
+              <w:end w:val="single" w:sz="4" w:space="0" w:color="000000"/>
+            </w:tcBorders>
+          </w:tcPr>
+          <w:p>
+            <w:pPr>
+              <w:pStyle w:val="Normal"/>
+              <w:snapToGrid w:val="false"/>
+              <w:rPr>
+                <w:bCs/>
+              </w:rPr>
+            </w:pPr>
+            <w:r>
+              <w:rPr>
+                <w:bCs/>
+              </w:rPr>
+              <w:t>08/27/2026</w:t>
+            </w:r>
+          </w:p>
+        </w:tc>
+      </w:tr>
+      <w:tr>
+        <w:trPr/>
+        <w:tc>
+          <w:tcPr>
+            <w:tcW w:w="1998" w:type="dxa"/>
+            <w:tcBorders>
+              <w:top w:val="single" w:sz="4" w:space="0" w:color="000000"/>
+              <w:start w:val="single" w:sz="4" w:space="0" w:color="000000"/>
+              <w:bottom w:val="single" w:sz="4" w:space="0" w:color="000000"/>
+              <w:end w:val="single" w:sz="4" w:space="0" w:color="000000"/>
+            </w:tcBorders>
+          </w:tcPr>
+          <w:p>
+            <w:pPr>
+              <w:pStyle w:val="Normal"/>
+              <w:snapToGrid w:val="false"/>
+              <w:rPr>
+                <w:bCs/>
+              </w:rPr>
+            </w:pPr>
+            <w:r>
+              <w:rPr>
+                <w:bCs/>
+              </w:rPr>
+              <w:t>E2E Test Script</w:t>
+            </w:r>
+          </w:p>
+        </w:tc>
+        <w:tc>
+          <w:tcPr>
+            <w:tcW w:w="1908" w:type="dxa"/>
+            <w:tcBorders>
+              <w:top w:val="single" w:sz="4" w:space="0" w:color="000000"/>
+              <w:start w:val="single" w:sz="4" w:space="0" w:color="000000"/>
+              <w:bottom w:val="single" w:sz="4" w:space="0" w:color="000000"/>
+              <w:end w:val="single" w:sz="4" w:space="0" w:color="000000"/>
+            </w:tcBorders>
+          </w:tcPr>
+          <w:p>
+            <w:pPr>
+              <w:pStyle w:val="Normal"/>
+              <w:snapToGrid w:val="false"/>
+              <w:rPr>
+                <w:bCs/>
+              </w:rPr>
+            </w:pPr>
+            <w:r>
+              <w:rPr>
+                <w:bCs/>
+              </w:rPr>
+              <w:t>08/27/2026</w:t>
+            </w:r>
+          </w:p>
+        </w:tc>
+      </w:tr>
+      <w:tr>
+        <w:trPr/>
+        <w:tc>
+          <w:tcPr>
+            <w:tcW w:w="1998" w:type="dxa"/>
+            <w:tcBorders>
+              <w:top w:val="single" w:sz="4" w:space="0" w:color="000000"/>
+              <w:start w:val="single" w:sz="4" w:space="0" w:color="000000"/>
+              <w:bottom w:val="single" w:sz="4" w:space="0" w:color="000000"/>
+              <w:end w:val="single" w:sz="4" w:space="0" w:color="000000"/>
+            </w:tcBorders>
+          </w:tcPr>
+          <w:p>
+            <w:pPr>
+              <w:pStyle w:val="Normal"/>
+              <w:snapToGrid w:val="false"/>
+              <w:rPr>
+                <w:bCs/>
+              </w:rPr>
+            </w:pPr>
+            <w:r>
+              <w:rPr>
+                <w:bCs/>
+              </w:rPr>
+              <w:t>Test Exit Code</w:t>
+            </w:r>
+          </w:p>
+        </w:tc>
+        <w:tc>
+          <w:tcPr>
+            <w:tcW w:w="1908" w:type="dxa"/>
+            <w:tcBorders>
+              <w:top w:val="single" w:sz="4" w:space="0" w:color="000000"/>
+              <w:start w:val="single" w:sz="4" w:space="0" w:color="000000"/>
+              <w:bottom w:val="single" w:sz="4" w:space="0" w:color="000000"/>
+              <w:end w:val="single" w:sz="4" w:space="0" w:color="000000"/>
+            </w:tcBorders>
+          </w:tcPr>
+          <w:p>
+            <w:pPr>
+              <w:pStyle w:val="Normal"/>
+              <w:snapToGrid w:val="false"/>
+              <w:rPr>
+                <w:bCs/>
+              </w:rPr>
+            </w:pPr>
+            <w:r>
+              <w:rPr>
+                <w:bCs/>
+              </w:rPr>
+              <w:t>08/27/2026</w:t>
+            </w:r>
+          </w:p>
+        </w:tc>
+      </w:tr>
+      <w:tr>
+        <w:trPr/>
+        <w:tc>
+          <w:tcPr>
+            <w:tcW w:w="1998" w:type="dxa"/>
+            <w:tcBorders>
+              <w:top w:val="single" w:sz="4" w:space="0" w:color="000000"/>
+              <w:start w:val="single" w:sz="4" w:space="0" w:color="000000"/>
+              <w:bottom w:val="single" w:sz="4" w:space="0" w:color="000000"/>
+              <w:end w:val="single" w:sz="4" w:space="0" w:color="000000"/>
+            </w:tcBorders>
+          </w:tcPr>
+          <w:p>
+            <w:pPr>
+              <w:pStyle w:val="Normal"/>
+              <w:snapToGrid w:val="false"/>
+              <w:rPr>
+                <w:bCs/>
+              </w:rPr>
+            </w:pPr>
+            <w:r>
+              <w:rPr>
+                <w:bCs/>
+              </w:rPr>
+              <w:t>Typed Flash Messages</w:t>
+            </w:r>
+          </w:p>
+        </w:tc>
+        <w:tc>
+          <w:tcPr>
+            <w:tcW w:w="1908" w:type="dxa"/>
+            <w:tcBorders>
+              <w:top w:val="single" w:sz="4" w:space="0" w:color="000000"/>
+              <w:start w:val="single" w:sz="4" w:space="0" w:color="000000"/>
+              <w:bottom w:val="single" w:sz="4" w:space="0" w:color="000000"/>
+              <w:end w:val="single" w:sz="4" w:space="0" w:color="000000"/>
+            </w:tcBorders>
+          </w:tcPr>
+          <w:p>
+            <w:pPr>
+              <w:pStyle w:val="Normal"/>
+              <w:snapToGrid w:val="false"/>
+              <w:rPr>
+                <w:bCs/>
+              </w:rPr>
+            </w:pPr>
+            <w:r>
+              <w:rPr>
+                <w:bCs/>
+              </w:rPr>
+              <w:t>08/27/2026</w:t>
+            </w:r>
+          </w:p>
+        </w:tc>
+      </w:tr>
+      <w:tr>
+        <w:trPr/>
+        <w:tc>
+          <w:tcPr>
+            <w:tcW w:w="1998" w:type="dxa"/>
+            <w:tcBorders>
+              <w:top w:val="single" w:sz="4" w:space="0" w:color="000000"/>
+              <w:start w:val="single" w:sz="4" w:space="0" w:color="000000"/>
+              <w:bottom w:val="single" w:sz="4" w:space="0" w:color="000000"/>
+              <w:end w:val="single" w:sz="4" w:space="0" w:color="000000"/>
+            </w:tcBorders>
+          </w:tcPr>
+          <w:p>
+            <w:pPr>
+              <w:pStyle w:val="Normal"/>
+              <w:snapToGrid w:val="false"/>
+              <w:rPr>
+                <w:bCs/>
+              </w:rPr>
+            </w:pPr>
+            <w:r>
+              <w:rPr>
+                <w:bCs/>
+              </w:rPr>
+              <w:t>Cart Column Widths</w:t>
+            </w:r>
+          </w:p>
+        </w:tc>
+        <w:tc>
+          <w:tcPr>
+            <w:tcW w:w="1908" w:type="dxa"/>
+            <w:tcBorders>
+              <w:top w:val="single" w:sz="4" w:space="0" w:color="000000"/>
+              <w:start w:val="single" w:sz="4" w:space="0" w:color="000000"/>
+              <w:bottom w:val="single" w:sz="4" w:space="0" w:color="000000"/>
+              <w:end w:val="single" w:sz="4" w:space="0" w:color="000000"/>
+            </w:tcBorders>
+          </w:tcPr>
+          <w:p>
+            <w:pPr>
+              <w:pStyle w:val="Normal"/>
+              <w:snapToGrid w:val="false"/>
+              <w:rPr>
+                <w:bCs/>
+              </w:rPr>
+            </w:pPr>
+            <w:r>
+              <w:rPr>
+                <w:bCs/>
+              </w:rPr>
+              <w:t>08/27/2026</w:t>
+            </w:r>
+          </w:p>
+        </w:tc>
+      </w:tr>
+      <w:tr>
+        <w:trPr/>
+        <w:tc>
+          <w:tcPr>
+            <w:tcW w:w="1998" w:type="dxa"/>
+            <w:tcBorders>
+              <w:top w:val="single" w:sz="4" w:space="0" w:color="000000"/>
+              <w:start w:val="single" w:sz="4" w:space="0" w:color="000000"/>
+              <w:bottom w:val="single" w:sz="4" w:space="0" w:color="000000"/>
+              <w:end w:val="single" w:sz="4" w:space="0" w:color="000000"/>
+            </w:tcBorders>
+          </w:tcPr>
+          <w:p>
+            <w:pPr>
+              <w:pStyle w:val="Normal"/>
+              <w:snapToGrid w:val="false"/>
+              <w:rPr>
+                <w:bCs/>
+              </w:rPr>
+            </w:pPr>
+            <w:r>
+              <w:rPr>
+                <w:bCs/>
+              </w:rPr>
+              <w:t>Schema Verification</w:t>
+            </w:r>
+          </w:p>
+        </w:tc>
+        <w:tc>
+          <w:tcPr>
+            <w:tcW w:w="1908" w:type="dxa"/>
+            <w:tcBorders>
+              <w:top w:val="single" w:sz="4" w:space="0" w:color="000000"/>
+              <w:start w:val="single" w:sz="4" w:space="0" w:color="000000"/>
+              <w:bottom w:val="single" w:sz="4" w:space="0" w:color="000000"/>
+              <w:end w:val="single" w:sz="4" w:space="0" w:color="000000"/>
+            </w:tcBorders>
+          </w:tcPr>
+          <w:p>
+            <w:pPr>
+              <w:pStyle w:val="Normal"/>
+              <w:snapToGrid w:val="false"/>
+              <w:rPr>
+                <w:bCs/>
+              </w:rPr>
+            </w:pPr>
+            <w:r>
+              <w:rPr>
+                <w:bCs/>
+              </w:rPr>
+              <w:t>08/27/2026</w:t>
+            </w:r>
+          </w:p>
+        </w:tc>
+      </w:tr>
+      <w:tr>
+        <w:trPr/>
+        <w:tc>
+          <w:tcPr>
+            <w:tcW w:w="1998" w:type="dxa"/>
+            <w:tcBorders>
+              <w:top w:val="single" w:sz="4" w:space="0" w:color="000000"/>
+              <w:start w:val="single" w:sz="4" w:space="0" w:color="000000"/>
+              <w:bottom w:val="single" w:sz="4" w:space="0" w:color="000000"/>
+              <w:end w:val="single" w:sz="4" w:space="0" w:color="000000"/>
+            </w:tcBorders>
+          </w:tcPr>
+          <w:p>
+            <w:pPr>
+              <w:pStyle w:val="Normal"/>
+              <w:snapToGrid w:val="false"/>
+              <w:rPr>
+                <w:bCs/>
+              </w:rPr>
+            </w:pPr>
+            <w:r>
+              <w:rPr>
+                <w:bCs/>
+              </w:rPr>
+              <w:t>Week 5 Review Fixes</w:t>
+            </w:r>
+          </w:p>
+        </w:tc>
+        <w:tc>
+          <w:tcPr>
+            <w:tcW w:w="1908" w:type="dxa"/>
+            <w:tcBorders>
+              <w:top w:val="single" w:sz="4" w:space="0" w:color="000000"/>
+              <w:start w:val="single" w:sz="4" w:space="0" w:color="000000"/>
+              <w:bottom w:val="single" w:sz="4" w:space="0" w:color="000000"/>
+              <w:end w:val="single" w:sz="4" w:space="0" w:color="000000"/>
+            </w:tcBorders>
+          </w:tcPr>
+          <w:p>
+            <w:pPr>
+              <w:pStyle w:val="Normal"/>
+              <w:snapToGrid w:val="false"/>
+              <w:rPr>
+                <w:bCs/>
+              </w:rPr>
+            </w:pPr>
+            <w:r>
+              <w:rPr>
+                <w:bCs/>
+              </w:rPr>
+              <w:t>08/27/2026</w:t>
+            </w:r>
+          </w:p>
+        </w:tc>
+      </w:tr>
+      <w:tr>
+        <w:trPr/>
+        <w:tc>
+          <w:tcPr>
+            <w:tcW w:w="1998" w:type="dxa"/>
+            <w:tcBorders>
+              <w:top w:val="single" w:sz="4" w:space="0" w:color="000000"/>
+              <w:start w:val="single" w:sz="4" w:space="0" w:color="000000"/>
+              <w:bottom w:val="single" w:sz="4" w:space="0" w:color="000000"/>
+              <w:end w:val="single" w:sz="4" w:space="0" w:color="000000"/>
+            </w:tcBorders>
+          </w:tcPr>
+          <w:p>
+            <w:pPr>
+              <w:pStyle w:val="Normal"/>
+              <w:snapToGrid w:val="false"/>
+              <w:rPr>
+                <w:bCs/>
+              </w:rPr>
+            </w:pPr>
+            <w:r>
+              <w:rPr>
+                <w:bCs/>
+              </w:rPr>
+              <w:t>Screenshot Tooling</w:t>
+            </w:r>
+          </w:p>
+        </w:tc>
+        <w:tc>
+          <w:tcPr>
+            <w:tcW w:w="1908" w:type="dxa"/>
+            <w:tcBorders>
+              <w:top w:val="single" w:sz="4" w:space="0" w:color="000000"/>
+              <w:start w:val="single" w:sz="4" w:space="0" w:color="000000"/>
+              <w:bottom w:val="single" w:sz="4" w:space="0" w:color="000000"/>
+              <w:end w:val="single" w:sz="4" w:space="0" w:color="000000"/>
+            </w:tcBorders>
+          </w:tcPr>
+          <w:p>
+            <w:pPr>
+              <w:pStyle w:val="Normal"/>
+              <w:snapToGrid w:val="false"/>
+              <w:rPr>
+                <w:bCs/>
+              </w:rPr>
+            </w:pPr>
+            <w:r>
+              <w:rPr>
+                <w:bCs/>
+              </w:rPr>
+              <w:t>08/27/2026</w:t>
             </w:r>
           </w:p>
         </w:tc>
@@ -10729,6 +11884,7 @@
                 <w:b/>
                 <w:bCs/>
               </w:rPr>
+              <w:t>None. All planned Week 5 tasks were completed, plus 7 unplanned items beyond the two already carried into the Week 5 breakdown.</w:t>
             </w:r>
           </w:p>
         </w:tc>
@@ -10869,6 +12025,146 @@
           <w:i/>
           <w:iCs/>
         </w:rPr>
+        <w:t>No planned work was prevented or delayed this week, and every task in the Week 5 breakdown is complete. Five problems came up and all five were resolved.</w:t>
+      </w:r>
+    </w:p>
+    <w:p>
+      <w:pPr>
+        <w:pStyle w:val="Normal"/>
+        <w:ind w:start="720" w:end="0"/>
+        <w:rPr>
+          <w:bCs/>
+          <w:i/>
+          <w:i/>
+          <w:iCs/>
+        </w:rPr>
+      </w:pPr>
+      <w:r>
+        <w:rPr>
+          <w:bCs/>
+          <w:i/>
+          <w:iCs/>
+        </w:rPr>
+        <w:t>The first was tooling, for the third time in this project. Headless Chrome hung when capturing the submission screenshots, exactly as it did in Weeks 2 and 4, and the --headless=new mode that fixed it in Week 4 no longer did. Diagnosing it properly rather than retrying showed the failure is narrower than "Chrome hangs": Chrome renders the page and writes the PNG correctly, then fails to exit. The capture now runs in the background with the background-networking, sync, and component-update services disabled, and is killed once the file exists. The screenshots are taken from the live render rather than a mockup, as in previous weeks.</w:t>
+      </w:r>
+    </w:p>
+    <w:p>
+      <w:pPr>
+        <w:pStyle w:val="Normal"/>
+        <w:ind w:start="720" w:end="0"/>
+        <w:rPr>
+          <w:bCs/>
+          <w:i/>
+          <w:i/>
+          <w:iCs/>
+        </w:rPr>
+      </w:pPr>
+      <w:r>
+        <w:rPr>
+          <w:bCs/>
+          <w:i/>
+          <w:iCs/>
+        </w:rPr>
+        <w:t>The second was a test that failed for the wrong reason. Two end-to-end checks on the CSRF rejection message failed on the first full run. Before changing the application I reproduced the sequence by hand with curl, which showed the application was correct: a flash message is consumed by the first page that renders it, and the helper my script uses to read a quantity renders one, so it was taking the message before the assertion could see it. The fix was to the test, not the code. That distinction was worth the ten minutes — the alternative was to "fix" a working feature.</w:t>
+      </w:r>
+    </w:p>
+    <w:p>
+      <w:pPr>
+        <w:pStyle w:val="Normal"/>
+        <w:ind w:start="720" w:end="0"/>
+        <w:rPr>
+          <w:bCs/>
+          <w:i/>
+          <w:i/>
+          <w:iCs/>
+        </w:rPr>
+      </w:pPr>
+      <w:r>
+        <w:rPr>
+          <w:bCs/>
+          <w:i/>
+          <w:iCs/>
+        </w:rPr>
+        <w:t>The third was a verification method that could not fail. My first pass at the MVC layer-boundary sweep used grep with an --include pattern that the shell expanded before grep saw it, so three of the six checks never ran and the sweep still printed a clean result. I only noticed because the output was suspiciously empty. Re-run with the pattern quoted, the sweep is genuinely clean. This is the same failure shape as the exit-code defect below, and finding both in the same week made the point that a check which cannot fail is not a check.</w:t>
+      </w:r>
+    </w:p>
+    <w:p>
+      <w:pPr>
+        <w:pStyle w:val="Normal"/>
+        <w:ind w:start="720" w:end="0"/>
+        <w:rPr>
+          <w:bCs/>
+          <w:i/>
+          <w:i/>
+          <w:iCs/>
+        </w:rPr>
+      </w:pPr>
+      <w:r>
+        <w:rPr>
+          <w:bCs/>
+          <w:i/>
+          <w:iCs/>
+        </w:rPr>
+        <w:t>The fourth was not a barrier so much as the most useful thing testing found all term. The test suite had been reporting success when the database was unreachable. config/database.php ended with exit() given a message string, and in PHP that exits with status 0, so the suite stopped part-way through, never ran three of its six files, and still exited clean. Every "the suite passes" claim I had made in a week where MySQL happened to be down would have been wrong. I reproduced it deliberately by pointing the file at a dead port — the old file exits 0, the fixed one exits 1 — rather than assuming the change worked.</w:t>
+      </w:r>
+    </w:p>
+    <w:p>
+      <w:pPr>
+        <w:pStyle w:val="Normal"/>
+        <w:ind w:start="720" w:end="0"/>
+        <w:rPr>
+          <w:bCs/>
+          <w:i/>
+          <w:i/>
+          <w:iCs/>
+        </w:rPr>
+      </w:pPr>
+      <w:r>
+        <w:rPr>
+          <w:bCs/>
+          <w:i/>
+          <w:iCs/>
+        </w:rPr>
+        <w:t>The fifth came out of the code review I ran over the Week 5 diff before calling the week done. It raised seven findings and I verified each one against the running application rather than taking it at face value. It found no correctness bug in the application code, but four of the seven were defects in the test script I had just written — two checks that could not have failed whatever the application did, one that reported a pass when the database was unreachable, and a probe row that a interrupted run would leave behind. Fixing the third of those, I wrote the guard with the same bug it was meant to prevent: exit inside a command substitution only leaves the subshell, so the script sailed past a dead database and still reported 69 checks passed. That is what made me start proving each repaired check by deliberately breaking the behavior it watches and confirming it goes red. The two application findings were a forged POST that could replace a visitor's order confirmation with a failure notice, and an aria-labelledby on a roleless span that no screen reader would announce.</w:t>
+      </w:r>
+    </w:p>
+    <w:p>
+      <w:pPr>
+        <w:pStyle w:val="Normal"/>
+        <w:ind w:start="720" w:end="0"/>
+        <w:rPr>
+          <w:bCs/>
+          <w:i/>
+          <w:i/>
+          <w:iCs/>
+        </w:rPr>
+      </w:pPr>
+      <w:r>
+        <w:rPr>
+          <w:bCs/>
+          <w:i/>
+          <w:iCs/>
+        </w:rPr>
+        <w:t>Two decisions are worth recording. The CSRF check is verified in the front controller rather than in the five CartController methods, because it is request plumbing of the same kind as the HTTP verb check already there, and one choke point cannot be forgotten by a route added later. And the UI task was scoped up from the light styling pass in my original plan to a genuine rework of the catalog, because a table was the wrong element for a set of products being browsed and on a narrow screen it could only be made to fit by hiding every product description.</w:t>
+      </w:r>
+    </w:p>
+    <w:p>
+      <w:pPr>
+        <w:pStyle w:val="Normal"/>
+        <w:ind w:start="720" w:end="0"/>
+        <w:rPr>
+          <w:bCs/>
+          <w:i/>
+          <w:i/>
+          <w:iCs/>
+        </w:rPr>
+      </w:pPr>
+      <w:r>
+        <w:rPr>
+          <w:bCs/>
+          <w:i/>
+          <w:iCs/>
+        </w:rPr>
       </w:r>
     </w:p>
     <w:p>
@@ -10908,6 +12204,146 @@
           <w:iCs/>
         </w:rPr>
         <w:t>Describe any lessons you learned through the planning and project execution process and anything you would do differently if you were starting over.</w:t>
+      </w:r>
+    </w:p>
+    <w:p>
+      <w:pPr>
+        <w:pStyle w:val="Normal"/>
+        <w:ind w:start="720" w:end="0"/>
+        <w:rPr>
+          <w:bCs/>
+          <w:i/>
+          <w:i/>
+          <w:iCs/>
+        </w:rPr>
+      </w:pPr>
+      <w:r>
+        <w:rPr>
+          <w:bCs/>
+          <w:i/>
+          <w:iCs/>
+        </w:rPr>
+        <w:t>The single most valuable habit this project taught me is that a passing check is only evidence if it was capable of failing. I found two instances of the opposite in Week 5 alone: a test suite that exited 0 while skipping half its files, and a source-code sweep that silently matched nothing because the shell ate its argument. Both looked exactly like success. If I started over I would write the deliberate failure case first — break the thing, watch the check go red, then fix it — for any check I intend to trust later.</w:t>
+      </w:r>
+    </w:p>
+    <w:p>
+      <w:pPr>
+        <w:pStyle w:val="Normal"/>
+        <w:ind w:start="720" w:end="0"/>
+        <w:rPr>
+          <w:bCs/>
+          <w:i/>
+          <w:i/>
+          <w:iCs/>
+        </w:rPr>
+      </w:pPr>
+      <w:r>
+        <w:rPr>
+          <w:bCs/>
+          <w:i/>
+          <w:iCs/>
+        </w:rPr>
+        <w:t>Planning the work so the application never broke was the decision that paid off most. In Week 4 I sequenced the MVC re-architecture so the first eight tasks only added files alongside the working Week 3 code and a single ninth commit swapped the entry point. The store served and the suite passed at every commit, so any breakage would have pointed at exactly one change. Rewriting everything at once would have left a week with no working baseline and no way to tell a refactoring mistake from a pre-existing bug.</w:t>
+      </w:r>
+    </w:p>
+    <w:p>
+      <w:pPr>
+        <w:pStyle w:val="Normal"/>
+        <w:ind w:start="720" w:end="0"/>
+        <w:rPr>
+          <w:bCs/>
+          <w:i/>
+          <w:i/>
+          <w:iCs/>
+        </w:rPr>
+      </w:pPr>
+      <w:r>
+        <w:rPr>
+          <w:bCs/>
+          <w:i/>
+          <w:iCs/>
+        </w:rPr>
+        <w:t>I deferred the CSRF work twice — out of Week 3, then out of Week 4 — each time with a defensible reason, and each time it was the same item. It only got done because I wrote it into the following week's breakdown rather than leaving it as a note in the barriers section. Starting over, I would put a security item on the schedule in the week it is identified. The reasoning that justified the deferral was sound both times, which is exactly why it would have justified a third.</w:t>
+      </w:r>
+    </w:p>
+    <w:p>
+      <w:pPr>
+        <w:pStyle w:val="Normal"/>
+        <w:ind w:start="720" w:end="0"/>
+        <w:rPr>
+          <w:bCs/>
+          <w:i/>
+          <w:i/>
+          <w:iCs/>
+        </w:rPr>
+      </w:pPr>
+      <w:r>
+        <w:rPr>
+          <w:bCs/>
+          <w:i/>
+          <w:iCs/>
+        </w:rPr>
+        <w:t>Tests told me the code was right; only looking at the rendered page told me the page was right. The cart clipped its Remove buttons off the right edge while every automated check passed, because the markup and the HTTP response were both correct. Automated tests and visual inspection cover genuinely different failures and neither substitutes for the other.</w:t>
+      </w:r>
+    </w:p>
+    <w:p>
+      <w:pPr>
+        <w:pStyle w:val="Normal"/>
+        <w:ind w:start="720" w:end="0"/>
+        <w:rPr>
+          <w:bCs/>
+          <w:i/>
+          <w:i/>
+          <w:iCs/>
+        </w:rPr>
+      </w:pPr>
+      <w:r>
+        <w:rPr>
+          <w:bCs/>
+          <w:i/>
+          <w:iCs/>
+        </w:rPr>
+        <w:t>Writing the design down before coding caught problems that reading the code never would have. Reviewing the Week 4 plan against the Week 4 spec found four gaps in the spec itself — a missing helpers file, two missing test suites, and a guard specified for one operation when it belonged on two — all before a single file moved. An hour of writing saved considerably more than an hour of debugging.</w:t>
+      </w:r>
+    </w:p>
+    <w:p>
+      <w:pPr>
+        <w:pStyle w:val="Normal"/>
+        <w:ind w:start="720" w:end="0"/>
+        <w:rPr>
+          <w:bCs/>
+          <w:i/>
+          <w:i/>
+          <w:iCs/>
+        </w:rPr>
+      </w:pPr>
+      <w:r>
+        <w:rPr>
+          <w:bCs/>
+          <w:i/>
+          <w:iCs/>
+        </w:rPr>
+        <w:t>The thing I would do differently is the arithmetic. I built Weeks 2 and 3 with floating-point currency and had to convert the whole application to whole integer cents in Week 3 when a code review pointed out that the printed line items would not always add up to the printed total. It was the right fix but it touched the model, the views, and every test. Choosing the integer representation on day one would have cost nothing; retrofitting it cost a substantial part of a week. The general lesson is that representation decisions are cheap to make correctly and expensive to change, so they deserve more thought at the start than they feel like they need.</w:t>
+      </w:r>
+    </w:p>
+    <w:p>
+      <w:pPr>
+        <w:pStyle w:val="Normal"/>
+        <w:ind w:start="720" w:end="0"/>
+        <w:rPr>
+          <w:bCs/>
+          <w:i/>
+          <w:i/>
+          <w:iCs/>
+        </w:rPr>
+      </w:pPr>
+      <w:r>
+        <w:rPr>
+          <w:bCs/>
+          <w:i/>
+          <w:iCs/>
+        </w:rPr>
+        <w:t>Finally, one branch and one pull request per week was worth the small overhead. Each milestone is a reviewable unit with its own history, and writing a real commit message forced me to articulate why each change was necessary. Several times the act of writing the justification is what showed me the change was not.</w:t>
       </w:r>
     </w:p>
     <w:p>

</xml_diff>

<commit_message>
Week 5: bring the submission documents up to date with the tag rename
The test description named Phase5 as the tag under test; the submission
tag is now Phase4. It also now says that the figures were confirmed
against a fresh clone of the submitted tag rather than only against the
working copy, which is what actually happened.

The project plan gains a Submission Tag entry in the Week 5 work
breakdown and a paragraph in the barriers section recording why Phase4
moved, what was done to avoid losing the Week 4 marker, and how the
result was verified.

Co-Authored-By: Claude Opus 5 (1M context) <noreply@anthropic.com>
Claude-Session: https://claude.ai/code/session_01H6nsTeiu9gKpXAcxNDLJhA
</commit_message>
<xml_diff>
--- a/docs/SDC310L Project Plan James Strohm.docx
+++ b/docs/SDC310L Project Plan James Strohm.docx
@@ -10684,6 +10684,87 @@
               <w:rPr>
                 <w:bCs/>
               </w:rPr>
+              <w:t>Submission Tag</w:t>
+            </w:r>
+          </w:p>
+        </w:tc>
+        <w:tc>
+          <w:tcPr>
+            <w:tcW w:w="4230" w:type="dxa"/>
+            <w:tcBorders>
+              <w:top w:val="single" w:sz="4" w:space="0" w:color="000000"/>
+              <w:start w:val="single" w:sz="4" w:space="0" w:color="000000"/>
+              <w:bottom w:val="single" w:sz="4" w:space="0" w:color="000000"/>
+              <w:end w:val="single" w:sz="4" w:space="0" w:color="000000"/>
+            </w:tcBorders>
+          </w:tcPr>
+          <w:p>
+            <w:pPr>
+              <w:pStyle w:val="Normal"/>
+              <w:snapToGrid w:val="false"/>
+              <w:rPr>
+                <w:bCs/>
+              </w:rPr>
+            </w:pPr>
+            <w:r>
+              <w:rPr>
+                <w:bCs/>
+              </w:rPr>
+              <w:t>The Week 5 assignment asks for a tag named "Phase #4", but Weeks 2 through 4 were tagged by week number, so that name already marked the Week 4 MVC milestone. Phase4 now points at the Week 5 submission; the Week 4 snapshot it previously marked was tagged Phase4-week4 first, so nothing lost its marker; and Phase5 points at the same commit as Phase4 so the week-aligned scheme still reads correctly. The README schedule table was updated in the same commit, because a tag list that disagrees with the documentation is the first thing a reader would notice. Verified by cloning the Phase4 tag fresh from GitHub and running the test suite from the clone.</w:t>
+            </w:r>
+          </w:p>
+        </w:tc>
+        <w:tc>
+          <w:tcPr>
+            <w:tcW w:w="1908" w:type="dxa"/>
+            <w:tcBorders>
+              <w:top w:val="single" w:sz="4" w:space="0" w:color="000000"/>
+              <w:start w:val="single" w:sz="4" w:space="0" w:color="000000"/>
+              <w:bottom w:val="single" w:sz="4" w:space="0" w:color="000000"/>
+              <w:end w:val="single" w:sz="4" w:space="0" w:color="000000"/>
+            </w:tcBorders>
+          </w:tcPr>
+          <w:p>
+            <w:pPr>
+              <w:pStyle w:val="Normal"/>
+              <w:snapToGrid w:val="false"/>
+              <w:rPr>
+                <w:bCs/>
+              </w:rPr>
+            </w:pPr>
+            <w:r>
+              <w:rPr>
+                <w:bCs/>
+              </w:rPr>
+              <w:t>08/27/2026</w:t>
+            </w:r>
+          </w:p>
+        </w:tc>
+      </w:tr>
+      <w:tr>
+        <w:trPr/>
+        <w:tc>
+          <w:tcPr>
+            <w:tcW w:w="1998" w:type="dxa"/>
+            <w:tcBorders>
+              <w:top w:val="single" w:sz="4" w:space="0" w:color="000000"/>
+              <w:start w:val="single" w:sz="4" w:space="0" w:color="000000"/>
+              <w:bottom w:val="single" w:sz="4" w:space="0" w:color="000000"/>
+              <w:end w:val="single" w:sz="4" w:space="0" w:color="000000"/>
+            </w:tcBorders>
+          </w:tcPr>
+          <w:p>
+            <w:pPr>
+              <w:pStyle w:val="Normal"/>
+              <w:snapToGrid w:val="false"/>
+              <w:rPr>
+                <w:bCs/>
+              </w:rPr>
+            </w:pPr>
+            <w:r>
+              <w:rPr>
+                <w:bCs/>
+              </w:rPr>
               <w:t>Screenshot Tooling</w:t>
             </w:r>
           </w:p>
@@ -11696,6 +11777,61 @@
               <w:rPr>
                 <w:bCs/>
               </w:rPr>
+              <w:t>Submission Tag</w:t>
+            </w:r>
+          </w:p>
+        </w:tc>
+        <w:tc>
+          <w:tcPr>
+            <w:tcW w:w="1908" w:type="dxa"/>
+            <w:tcBorders>
+              <w:top w:val="single" w:sz="4" w:space="0" w:color="000000"/>
+              <w:start w:val="single" w:sz="4" w:space="0" w:color="000000"/>
+              <w:bottom w:val="single" w:sz="4" w:space="0" w:color="000000"/>
+              <w:end w:val="single" w:sz="4" w:space="0" w:color="000000"/>
+            </w:tcBorders>
+          </w:tcPr>
+          <w:p>
+            <w:pPr>
+              <w:pStyle w:val="Normal"/>
+              <w:snapToGrid w:val="false"/>
+              <w:rPr>
+                <w:bCs/>
+              </w:rPr>
+            </w:pPr>
+            <w:r>
+              <w:rPr>
+                <w:bCs/>
+              </w:rPr>
+              <w:t>08/27/2026</w:t>
+            </w:r>
+          </w:p>
+        </w:tc>
+      </w:tr>
+      <w:tr>
+        <w:trPr/>
+        <w:tc>
+          <w:tcPr>
+            <w:tcW w:w="1998" w:type="dxa"/>
+            <w:tcBorders>
+              <w:top w:val="single" w:sz="4" w:space="0" w:color="000000"/>
+              <w:start w:val="single" w:sz="4" w:space="0" w:color="000000"/>
+              <w:bottom w:val="single" w:sz="4" w:space="0" w:color="000000"/>
+              <w:end w:val="single" w:sz="4" w:space="0" w:color="000000"/>
+            </w:tcBorders>
+          </w:tcPr>
+          <w:p>
+            <w:pPr>
+              <w:pStyle w:val="Normal"/>
+              <w:snapToGrid w:val="false"/>
+              <w:rPr>
+                <w:bCs/>
+              </w:rPr>
+            </w:pPr>
+            <w:r>
+              <w:rPr>
+                <w:bCs/>
+              </w:rPr>
               <w:t>Screenshot Tooling</w:t>
             </w:r>
           </w:p>
@@ -11884,7 +12020,7 @@
                 <w:b/>
                 <w:bCs/>
               </w:rPr>
-              <w:t>None. All planned Week 5 tasks were completed, plus 7 unplanned items beyond the two already carried into the Week 5 breakdown.</w:t>
+              <w:t>None. All planned Week 5 tasks were completed, plus 8 unplanned items beyond the two already carried into the Week 5 breakdown.</w:t>
             </w:r>
           </w:p>
         </w:tc>
@@ -12126,6 +12262,26 @@
           <w:iCs/>
         </w:rPr>
         <w:t>The fifth came out of the code review I ran over the Week 5 diff before calling the week done. It raised seven findings and I verified each one against the running application rather than taking it at face value. It found no correctness bug in the application code, but four of the seven were defects in the test script I had just written — two checks that could not have failed whatever the application did, one that reported a pass when the database was unreachable, and a probe row that a interrupted run would leave behind. Fixing the third of those, I wrote the guard with the same bug it was meant to prevent: exit inside a command substitution only leaves the subshell, so the script sailed past a dead database and still reported 69 checks passed. That is what made me start proving each repaired check by deliberately breaking the behavior it watches and confirming it goes red. The two application findings were a forged POST that could replace a visitor's order confirmation with a failure notice, and an aria-labelledby on a roleless span that no screen reader would announce.</w:t>
+      </w:r>
+    </w:p>
+    <w:p>
+      <w:pPr>
+        <w:pStyle w:val="Normal"/>
+        <w:ind w:start="720" w:end="0"/>
+        <w:rPr>
+          <w:bCs/>
+          <w:i/>
+          <w:i/>
+          <w:iCs/>
+        </w:rPr>
+      </w:pPr>
+      <w:r>
+        <w:rPr>
+          <w:bCs/>
+          <w:i/>
+          <w:iCs/>
+        </w:rPr>
+        <w:t>One naming decision needed care rather than being a problem. The Week 5 assignment asks for a tag named "Phase #4", and that name was already in use for the Week 4 milestone under the week-numbered scheme I had followed since Week 2. Rather than overwrite it and lose the Week 4 marker, I tagged the Week 4 snapshot as Phase4-week4 first, then moved Phase4 to the Week 5 submission and left Phase5 on the same commit so the week-aligned reading still works. Both the README and this document record the mapping, and I confirmed the result by cloning the Phase4 tag from GitHub into a clean directory and running the test suite from that clone rather than from my working copy.</w:t>
       </w:r>
     </w:p>
     <w:p>

</xml_diff>